<commit_message>
Redesign AI resume with modern visual layout
Co-authored-by: Cursor <cursoragent@cursor.com>
</commit_message>
<xml_diff>
--- a/pdf/장원증_이력서_AI특화.docx
+++ b/pdf/장원증_이력서_AI특화.docx
@@ -2,32 +2,164 @@
 <file path=word/document.xml><?xml version="1.0" encoding="utf-8"?>
 <w:document xmlns:wpc="http://schemas.microsoft.com/office/word/2010/wordprocessingCanvas" xmlns:mo="http://schemas.microsoft.com/office/mac/office/2008/main" xmlns:mc="http://schemas.openxmlformats.org/markup-compatibility/2006" xmlns:mv="urn:schemas-microsoft-com:mac:vml" xmlns:o="urn:schemas-microsoft-com:office:office" xmlns:r="http://schemas.openxmlformats.org/officeDocument/2006/relationships" xmlns:m="http://schemas.openxmlformats.org/officeDocument/2006/math" xmlns:v="urn:schemas-microsoft-com:vml" xmlns:wp14="http://schemas.microsoft.com/office/word/2010/wordprocessingDrawing" xmlns:wp="http://schemas.openxmlformats.org/drawingml/2006/wordprocessingDrawing" xmlns:w10="urn:schemas-microsoft-com:office:word" xmlns:w="http://schemas.openxmlformats.org/wordprocessingml/2006/main" xmlns:w14="http://schemas.microsoft.com/office/word/2010/wordml" xmlns:wpg="http://schemas.microsoft.com/office/word/2010/wordprocessingGroup" xmlns:wpi="http://schemas.microsoft.com/office/word/2010/wordprocessingInk" xmlns:wne="http://schemas.microsoft.com/office/word/2006/wordml" xmlns:wps="http://schemas.microsoft.com/office/word/2010/wordprocessingShape" mc:Ignorable="w14 wp14">
   <w:body>
+    <w:tbl>
+      <w:tblPr>
+        <w:tblW w:type="auto" w:w="0"/>
+        <w:jc w:val="left"/>
+        <w:tblLook w:firstColumn="1" w:firstRow="1" w:lastColumn="0" w:lastRow="0" w:noHBand="0" w:noVBand="1" w:val="04A0"/>
+      </w:tblPr>
+      <w:tblGrid>
+        <w:gridCol w:w="5669"/>
+        <w:gridCol w:w="3969"/>
+      </w:tblGrid>
+      <w:tr>
+        <w:tc>
+          <w:tcPr>
+            <w:tcW w:type="dxa" w:w="5100"/>
+            <w:vAlign w:val="center"/>
+          </w:tcPr>
+          <w:p>
+            <w:r>
+              <w:rPr>
+                <w:b/>
+                <w:color w:val="0D47A1"/>
+                <w:sz w:val="56"/>
+              </w:rPr>
+              <w:t>장원증</w:t>
+            </w:r>
+          </w:p>
+          <w:p>
+            <w:r>
+              <w:rPr>
+                <w:b/>
+                <w:color w:val="1E88E5"/>
+                <w:sz w:val="26"/>
+              </w:rPr>
+              <w:t>AI-Driven Financial Engineer</w:t>
+            </w:r>
+          </w:p>
+          <w:p>
+            <w:r>
+              <w:rPr>
+                <w:color w:val="616161"/>
+                <w:sz w:val="18"/>
+              </w:rPr>
+              <w:t>금융 × 인공지능 융합 전문가  |  소프트웨어 학사 · 인공지능경제 석사</w:t>
+            </w:r>
+          </w:p>
+        </w:tc>
+        <w:tc>
+          <w:tcPr>
+            <w:tcW w:type="dxa" w:w="5100"/>
+            <w:vAlign w:val="center"/>
+          </w:tcPr>
+          <w:p>
+            <w:pPr>
+              <w:spacing w:before="20" w:after="20"/>
+              <w:jc w:val="right"/>
+            </w:pPr>
+            <w:r>
+              <w:rPr>
+                <w:color w:val="212121"/>
+                <w:sz w:val="18"/>
+              </w:rPr>
+              <w:t>📞  010.4259.1029</w:t>
+            </w:r>
+          </w:p>
+          <w:p>
+            <w:pPr>
+              <w:spacing w:before="20" w:after="20"/>
+              <w:jc w:val="right"/>
+            </w:pPr>
+            <w:r>
+              <w:rPr>
+                <w:color w:val="212121"/>
+                <w:sz w:val="18"/>
+              </w:rPr>
+              <w:t>📧  weonjoo@naver.com</w:t>
+            </w:r>
+          </w:p>
+          <w:p>
+            <w:pPr>
+              <w:spacing w:before="20" w:after="20"/>
+              <w:jc w:val="right"/>
+            </w:pPr>
+            <w:r>
+              <w:rPr>
+                <w:color w:val="212121"/>
+                <w:sz w:val="18"/>
+              </w:rPr>
+              <w:t>📍  서울시 강서구 마곡중앙1로 71</w:t>
+            </w:r>
+          </w:p>
+          <w:p>
+            <w:pPr>
+              <w:spacing w:before="20" w:after="20"/>
+              <w:jc w:val="right"/>
+            </w:pPr>
+            <w:r>
+              <w:rPr>
+                <w:color w:val="212121"/>
+                <w:sz w:val="18"/>
+              </w:rPr>
+              <w:t>🌐  https://wjjang.streamlit.app/</w:t>
+            </w:r>
+          </w:p>
+        </w:tc>
+      </w:tr>
+    </w:tbl>
     <w:p>
       <w:pPr>
-        <w:spacing w:after="40"/>
-        <w:jc w:val="center"/>
+        <w:spacing w:after="80"/>
+      </w:pPr>
+    </w:p>
+    <w:tbl>
+      <w:tblPr>
+        <w:tblW w:type="auto" w:w="0"/>
+        <w:jc w:val="left"/>
+        <w:tblLook w:firstColumn="1" w:firstRow="1" w:lastColumn="0" w:lastRow="0" w:noHBand="0" w:noVBand="1" w:val="04A0"/>
+      </w:tblPr>
+      <w:tblGrid>
+        <w:gridCol w:w="10200"/>
+      </w:tblGrid>
+      <w:tr>
+        <w:tc>
+          <w:tcPr>
+            <w:tcW w:type="dxa" w:w="10200"/>
+            <w:shd w:fill="0D47A1"/>
+          </w:tcPr>
+          <w:p>
+            <w:pPr>
+              <w:spacing w:before="0" w:after="0"/>
+            </w:pPr>
+            <w:r>
+              <w:rPr>
+                <w:b/>
+                <w:color w:val="FFFFFF"/>
+                <w:sz w:val="24"/>
+              </w:rPr>
+              <w:t xml:space="preserve">  🤖  인공지능 핵심 역량  (AI Core Competency)</w:t>
+            </w:r>
+          </w:p>
+        </w:tc>
+      </w:tr>
+    </w:tbl>
+    <w:p>
+      <w:pPr>
+        <w:spacing w:before="40" w:after="40"/>
+      </w:pPr>
+    </w:p>
+    <w:p>
+      <w:pPr>
+        <w:spacing w:after="120"/>
       </w:pPr>
       <w:r>
         <w:rPr>
           <w:b/>
-          <w:color w:val="1A3C6E"/>
-          <w:sz w:val="48"/>
+          <w:color w:val="212121"/>
+          <w:sz w:val="20"/>
         </w:rPr>
-        <w:t>PROFILE</w:t>
-      </w:r>
-    </w:p>
-    <w:p>
-      <w:pPr>
-        <w:spacing w:after="80"/>
-        <w:jc w:val="center"/>
-      </w:pPr>
-      <w:r>
-        <w:rPr>
-          <w:b/>
-          <w:color w:val="2E74B5"/>
-          <w:sz w:val="24"/>
-        </w:rPr>
-        <w:t>AI-Driven Financial Engineer | 금융 × 인공지능 융합 전문가</w:t>
+        <w:t>서강대 경제대학원 인공지능경제 석사를 기반으로, 금융 도메인에 특화된 AI/ML 시스템을 직접 설계·구현·운영해온 실전형 AI 엔지니어</w:t>
       </w:r>
     </w:p>
     <w:tbl>
@@ -37,157 +169,337 @@
         <w:tblLook w:firstColumn="1" w:firstRow="1" w:lastColumn="0" w:lastRow="0" w:noHBand="0" w:noVBand="1" w:val="04A0"/>
       </w:tblPr>
       <w:tblGrid>
-        <w:gridCol w:w="2493"/>
-        <w:gridCol w:w="2493"/>
-        <w:gridCol w:w="2493"/>
-        <w:gridCol w:w="2493"/>
+        <w:gridCol w:w="5100"/>
+        <w:gridCol w:w="5100"/>
       </w:tblGrid>
       <w:tr>
         <w:tc>
           <w:tcPr>
-            <w:tcW w:type="dxa" w:w="2493"/>
+            <w:tcW w:type="dxa" w:w="5100"/>
+            <w:shd w:fill="F5F5F5"/>
           </w:tcPr>
           <w:p>
+            <w:pPr>
+              <w:spacing w:before="120"/>
+            </w:pPr>
             <w:r>
               <w:rPr>
                 <w:b/>
-                <w:sz w:val="18"/>
+                <w:color w:val="0D47A1"/>
+                <w:sz w:val="20"/>
               </w:rPr>
-              <w:t>이름</w:t>
+              <w:t xml:space="preserve">  ◆ LLM &amp; Generative AI</w:t>
             </w:r>
+          </w:p>
+          <w:p>
+            <w:pPr>
+              <w:spacing w:before="20" w:after="20"/>
+              <w:ind w:left="170"/>
+            </w:pPr>
+            <w:r>
+              <w:rPr>
+                <w:sz w:val="17"/>
+              </w:rPr>
+              <w:t xml:space="preserve">  ▸ Multi-LLM 전략 (Qwen + GPT) 운용</w:t>
+            </w:r>
+          </w:p>
+          <w:p>
+            <w:pPr>
+              <w:spacing w:before="20" w:after="20"/>
+              <w:ind w:left="170"/>
+            </w:pPr>
+            <w:r>
+              <w:rPr>
+                <w:sz w:val="17"/>
+              </w:rPr>
+              <w:t xml:space="preserve">  ▸ RAG : LangChain + Chroma + OpenAI/Llama</w:t>
+            </w:r>
+          </w:p>
+          <w:p>
+            <w:pPr>
+              <w:spacing w:before="20" w:after="20"/>
+              <w:ind w:left="170"/>
+            </w:pPr>
+            <w:r>
+              <w:rPr>
+                <w:sz w:val="17"/>
+              </w:rPr>
+              <w:t xml:space="preserve">  ▸ PEFT 파인튜닝 (LoRA vs QLoRA)</w:t>
+            </w:r>
+          </w:p>
+          <w:p>
+            <w:pPr>
+              <w:spacing w:before="20" w:after="20"/>
+              <w:ind w:left="170"/>
+            </w:pPr>
+            <w:r>
+              <w:rPr>
+                <w:sz w:val="17"/>
+              </w:rPr>
+              <w:t xml:space="preserve">  ▸ Agentic AI / Vibe Coding 실전 적용</w:t>
+            </w:r>
+          </w:p>
+          <w:p>
+            <w:pPr>
+              <w:spacing w:after="80"/>
+            </w:pPr>
           </w:p>
         </w:tc>
         <w:tc>
           <w:tcPr>
-            <w:tcW w:type="dxa" w:w="2493"/>
+            <w:tcW w:type="dxa" w:w="5100"/>
+            <w:shd w:fill="F5F5F5"/>
           </w:tcPr>
           <w:p>
-            <w:r>
-              <w:t>장원증</w:t>
-            </w:r>
-          </w:p>
-        </w:tc>
-        <w:tc>
-          <w:tcPr>
-            <w:tcW w:type="dxa" w:w="2493"/>
-          </w:tcPr>
-          <w:p>
+            <w:pPr>
+              <w:spacing w:before="120"/>
+            </w:pPr>
             <w:r>
               <w:rPr>
                 <w:b/>
-                <w:sz w:val="18"/>
+                <w:color w:val="0D47A1"/>
+                <w:sz w:val="20"/>
               </w:rPr>
-              <w:t>생년월일</w:t>
+              <w:t xml:space="preserve">  ◆ ML &amp; Deep Learning</w:t>
             </w:r>
           </w:p>
-        </w:tc>
-        <w:tc>
-          <w:tcPr>
-            <w:tcW w:type="dxa" w:w="2493"/>
-          </w:tcPr>
           <w:p>
+            <w:pPr>
+              <w:spacing w:before="20" w:after="20"/>
+              <w:ind w:left="170"/>
+            </w:pPr>
             <w:r>
-              <w:t>1979.10.29</w:t>
+              <w:rPr>
+                <w:sz w:val="17"/>
+              </w:rPr>
+              <w:t xml:space="preserve">  ▸ Deep Momentum 롤링 강화학습</w:t>
             </w:r>
+          </w:p>
+          <w:p>
+            <w:pPr>
+              <w:spacing w:before="20" w:after="20"/>
+              <w:ind w:left="170"/>
+            </w:pPr>
+            <w:r>
+              <w:rPr>
+                <w:sz w:val="17"/>
+              </w:rPr>
+              <w:t xml:space="preserve">  ▸ k-means / Contrastive 클러스터링</w:t>
+            </w:r>
+          </w:p>
+          <w:p>
+            <w:pPr>
+              <w:spacing w:before="20" w:after="20"/>
+              <w:ind w:left="170"/>
+            </w:pPr>
+            <w:r>
+              <w:rPr>
+                <w:sz w:val="17"/>
+              </w:rPr>
+              <w:t xml:space="preserve">  ▸ OLS → Random Forest → LSTM 파이프라인</w:t>
+            </w:r>
+          </w:p>
+          <w:p>
+            <w:pPr>
+              <w:spacing w:before="20" w:after="20"/>
+              <w:ind w:left="170"/>
+            </w:pPr>
+            <w:r>
+              <w:rPr>
+                <w:sz w:val="17"/>
+              </w:rPr>
+              <w:t xml:space="preserve">  ▸ KNN 기반 AML 이상거래 탐지</w:t>
+            </w:r>
+          </w:p>
+          <w:p>
+            <w:pPr>
+              <w:spacing w:after="80"/>
+            </w:pPr>
           </w:p>
         </w:tc>
       </w:tr>
       <w:tr>
         <w:tc>
           <w:tcPr>
-            <w:tcW w:type="dxa" w:w="2493"/>
+            <w:tcW w:type="dxa" w:w="5100"/>
+            <w:shd w:fill="F5F5F5"/>
           </w:tcPr>
           <w:p>
+            <w:pPr>
+              <w:spacing w:before="120"/>
+            </w:pPr>
             <w:r>
               <w:rPr>
                 <w:b/>
-                <w:sz w:val="18"/>
+                <w:color w:val="0D47A1"/>
+                <w:sz w:val="20"/>
               </w:rPr>
-              <w:t>전화번호</w:t>
+              <w:t xml:space="preserve">  ◆ OCR &amp; 문서 자동화</w:t>
             </w:r>
+          </w:p>
+          <w:p>
+            <w:pPr>
+              <w:spacing w:before="20" w:after="20"/>
+              <w:ind w:left="170"/>
+            </w:pPr>
+            <w:r>
+              <w:rPr>
+                <w:sz w:val="17"/>
+              </w:rPr>
+              <w:t xml:space="preserve">  ▸ Tesseract → Llama3.1 정형화 파이프라인</w:t>
+            </w:r>
+          </w:p>
+          <w:p>
+            <w:pPr>
+              <w:spacing w:before="20" w:after="20"/>
+              <w:ind w:left="170"/>
+            </w:pPr>
+            <w:r>
+              <w:rPr>
+                <w:sz w:val="17"/>
+              </w:rPr>
+              <w:t xml:space="preserve">  ▸ 비정형 공시 → 구조화 JSON 자동 추출</w:t>
+            </w:r>
+          </w:p>
+          <w:p>
+            <w:pPr>
+              <w:spacing w:before="20" w:after="20"/>
+              <w:ind w:left="170"/>
+            </w:pPr>
+            <w:r>
+              <w:rPr>
+                <w:sz w:val="17"/>
+              </w:rPr>
+              <w:t xml:space="preserve">  ▸ 신탁 시스템 실제 운영 탑재</w:t>
+            </w:r>
+          </w:p>
+          <w:p>
+            <w:pPr>
+              <w:spacing w:after="80"/>
+            </w:pPr>
           </w:p>
         </w:tc>
         <w:tc>
           <w:tcPr>
-            <w:tcW w:type="dxa" w:w="2493"/>
+            <w:tcW w:type="dxa" w:w="5100"/>
+            <w:shd w:fill="F5F5F5"/>
           </w:tcPr>
           <w:p>
-            <w:r>
-              <w:t>010.4259.1029</w:t>
-            </w:r>
-          </w:p>
-        </w:tc>
-        <w:tc>
-          <w:tcPr>
-            <w:tcW w:type="dxa" w:w="2493"/>
-          </w:tcPr>
-          <w:p>
+            <w:pPr>
+              <w:spacing w:before="120"/>
+            </w:pPr>
             <w:r>
               <w:rPr>
                 <w:b/>
-                <w:sz w:val="18"/>
+                <w:color w:val="0D47A1"/>
+                <w:sz w:val="20"/>
               </w:rPr>
-              <w:t>E-mail</w:t>
+              <w:t xml:space="preserve">  ◆ 금융공학 AI 융합</w:t>
             </w:r>
           </w:p>
-        </w:tc>
-        <w:tc>
-          <w:tcPr>
-            <w:tcW w:type="dxa" w:w="2493"/>
-          </w:tcPr>
           <w:p>
+            <w:pPr>
+              <w:spacing w:before="20" w:after="20"/>
+              <w:ind w:left="170"/>
+            </w:pPr>
             <w:r>
-              <w:t>weonjoo@naver.com</w:t>
+              <w:rPr>
+                <w:sz w:val="17"/>
+              </w:rPr>
+              <w:t xml:space="preserve">  ▸ MVO / Black-Litterman 자산배분</w:t>
             </w:r>
+          </w:p>
+          <w:p>
+            <w:pPr>
+              <w:spacing w:before="20" w:after="20"/>
+              <w:ind w:left="170"/>
+            </w:pPr>
+            <w:r>
+              <w:rPr>
+                <w:sz w:val="17"/>
+              </w:rPr>
+              <w:t xml:space="preserve">  ▸ Brinson / Lehmann / Campisi 성과분해</w:t>
+            </w:r>
+          </w:p>
+          <w:p>
+            <w:pPr>
+              <w:spacing w:before="20" w:after="20"/>
+              <w:ind w:left="170"/>
+            </w:pPr>
+            <w:r>
+              <w:rPr>
+                <w:sz w:val="17"/>
+              </w:rPr>
+              <w:t xml:space="preserve">  ▸ Multi-Factor 모델</w:t>
+            </w:r>
+          </w:p>
+          <w:p>
+            <w:pPr>
+              <w:spacing w:before="20" w:after="20"/>
+              <w:ind w:left="170"/>
+            </w:pPr>
+            <w:r>
+              <w:rPr>
+                <w:sz w:val="17"/>
+              </w:rPr>
+              <w:t xml:space="preserve">  ▸ CARINO smoothing / Risk Parity</w:t>
+            </w:r>
+          </w:p>
+          <w:p>
+            <w:pPr>
+              <w:spacing w:after="80"/>
+            </w:pPr>
           </w:p>
         </w:tc>
       </w:tr>
+    </w:tbl>
+    <w:p>
+      <w:pPr>
+        <w:spacing w:before="120"/>
+      </w:pPr>
+      <w:r>
+        <w:rPr>
+          <w:b/>
+          <w:color w:val="FFFFFF"/>
+          <w:sz w:val="16"/>
+        </w:rPr>
+        <w:t xml:space="preserve">TECH  </w:t>
+      </w:r>
+      <w:r>
+        <w:rPr>
+          <w:b/>
+          <w:color w:val="1E88E5"/>
+          <w:sz w:val="17"/>
+        </w:rPr>
+        <w:t>Python   LangChain   Chroma   OpenAI   Llama   Qwen   Ollama   LoRA   QLoRA   RAG   LSTM   OCR   Flask   Streamlit   R   JAVA   Oracle   Pro*C   MongoDB</w:t>
+      </w:r>
+    </w:p>
+    <w:tbl>
+      <w:tblPr>
+        <w:tblW w:type="auto" w:w="0"/>
+        <w:jc w:val="left"/>
+        <w:tblLook w:firstColumn="1" w:firstRow="1" w:lastColumn="0" w:lastRow="0" w:noHBand="0" w:noVBand="1" w:val="04A0"/>
+      </w:tblPr>
+      <w:tblGrid>
+        <w:gridCol w:w="10200"/>
+      </w:tblGrid>
       <w:tr>
         <w:tc>
           <w:tcPr>
-            <w:tcW w:type="dxa" w:w="2493"/>
+            <w:tcW w:type="dxa" w:w="10200"/>
+            <w:shd w:fill="0D47A1"/>
           </w:tcPr>
           <w:p>
+            <w:pPr>
+              <w:spacing w:before="0" w:after="0"/>
+            </w:pPr>
             <w:r>
               <w:rPr>
                 <w:b/>
-                <w:sz w:val="18"/>
+                <w:color w:val="FFFFFF"/>
+                <w:sz w:val="24"/>
               </w:rPr>
-              <w:t>주소</w:t>
-            </w:r>
-          </w:p>
-        </w:tc>
-        <w:tc>
-          <w:tcPr>
-            <w:tcW w:type="dxa" w:w="2493"/>
-          </w:tcPr>
-          <w:p>
-            <w:r>
-              <w:t>서울시 강서구 마곡중앙1로 71 마곡13단지</w:t>
-            </w:r>
-          </w:p>
-        </w:tc>
-        <w:tc>
-          <w:tcPr>
-            <w:tcW w:type="dxa" w:w="2493"/>
-          </w:tcPr>
-          <w:p>
-            <w:r>
-              <w:rPr>
-                <w:b/>
-                <w:sz w:val="18"/>
-              </w:rPr>
-              <w:t>포트폴리오</w:t>
-            </w:r>
-          </w:p>
-        </w:tc>
-        <w:tc>
-          <w:tcPr>
-            <w:tcW w:type="dxa" w:w="2493"/>
-          </w:tcPr>
-          <w:p>
-            <w:r>
-              <w:t>https://wjjang.streamlit.app/</w:t>
+              <w:t xml:space="preserve">  🎓  학력</w:t>
             </w:r>
           </w:p>
         </w:tc>
@@ -195,248 +507,27 @@
     </w:tbl>
     <w:p>
       <w:pPr>
-        <w:spacing w:before="240" w:after="80"/>
+        <w:spacing w:before="40" w:after="40"/>
       </w:pPr>
-      <w:r>
-        <w:rPr>
-          <w:b/>
-          <w:color w:val="1A3C6E"/>
-          <w:sz w:val="26"/>
-        </w:rPr>
-        <w:t>▶ 인공지능 핵심 역량 (AI Core Competency)</w:t>
-      </w:r>
-    </w:p>
-    <w:p>
-      <w:pPr>
-        <w:spacing w:before="80"/>
-      </w:pPr>
-      <w:r>
-        <w:rPr>
-          <w:sz w:val="20"/>
-        </w:rPr>
-        <w:t>서강대학교 경제대학원 인공지능경제 석사 학위를 기반으로, 금융 도메인에 특화된 AI/ML 시스템을 직접 설계·구현·운영해온 실전형 AI 엔지니어입니다.</w:t>
-      </w:r>
-    </w:p>
-    <w:p>
-      <w:pPr>
-        <w:spacing w:before="160"/>
-      </w:pPr>
-      <w:r>
-        <w:rPr>
-          <w:b/>
-          <w:color w:val="2E74B5"/>
-          <w:sz w:val="22"/>
-        </w:rPr>
-        <w:t>LLM &amp; Generative AI</w:t>
-      </w:r>
-    </w:p>
-    <w:p>
-      <w:pPr>
-        <w:spacing w:before="20" w:after="20"/>
-        <w:ind w:left="283"/>
-      </w:pPr>
-      <w:r>
-        <w:rPr>
-          <w:sz w:val="20"/>
-        </w:rPr>
-        <w:t>• Multi-LLM 전략 운용 : Qwen(비용 효율) + GPT(정밀도 보완) 조합으로 비정형 공시 데이터 → 구조화 JSON 자동 추출</w:t>
-      </w:r>
-    </w:p>
-    <w:p>
-      <w:pPr>
-        <w:spacing w:before="20" w:after="20"/>
-        <w:ind w:left="283"/>
-      </w:pPr>
-      <w:r>
-        <w:rPr>
-          <w:sz w:val="20"/>
-        </w:rPr>
-        <w:t>• RAG 시스템 다수 구축 : LangChain + Chroma 벡터DB + OpenAI/Llama 모델 기반 도메인 특화 챗봇 개발</w:t>
-      </w:r>
-    </w:p>
-    <w:p>
-      <w:pPr>
-        <w:spacing w:before="20" w:after="20"/>
-        <w:ind w:left="283"/>
-      </w:pPr>
-      <w:r>
-        <w:rPr>
-          <w:sz w:val="20"/>
-        </w:rPr>
-        <w:t>• PEFT 파인튜닝 연구 : LoRA vs QLoRA 비교 분석을 통한 도메인 특화 LLM 최적화</w:t>
-      </w:r>
-    </w:p>
-    <w:p>
-      <w:pPr>
-        <w:spacing w:before="20" w:after="20"/>
-        <w:ind w:left="283"/>
-      </w:pPr>
-      <w:r>
-        <w:rPr>
-          <w:sz w:val="20"/>
-        </w:rPr>
-        <w:t>• Agentic AI / Vibe Coding : AI 에이전트 활용 개발 워크플로우 실전 적용</w:t>
-      </w:r>
-    </w:p>
-    <w:p>
-      <w:pPr>
-        <w:spacing w:before="160"/>
-      </w:pPr>
-      <w:r>
-        <w:rPr>
-          <w:b/>
-          <w:color w:val="2E74B5"/>
-          <w:sz w:val="22"/>
-        </w:rPr>
-        <w:t>Machine Learning &amp; Deep Learning</w:t>
-      </w:r>
-    </w:p>
-    <w:p>
-      <w:pPr>
-        <w:spacing w:before="20" w:after="20"/>
-        <w:ind w:left="283"/>
-      </w:pPr>
-      <w:r>
-        <w:rPr>
-          <w:sz w:val="20"/>
-        </w:rPr>
-        <w:t>• Deep Momentum 모델 : 글로벌 자산(주식, 채권, ETF) 롤링 강화학습 기반 자산배분 예측</w:t>
-      </w:r>
-    </w:p>
-    <w:p>
-      <w:pPr>
-        <w:spacing w:before="20" w:after="20"/>
-        <w:ind w:left="283"/>
-      </w:pPr>
-      <w:r>
-        <w:rPr>
-          <w:sz w:val="20"/>
-        </w:rPr>
-        <w:t>• 클러스터링 : k-means, Contrastive Learning으로 25개 위험지표 기반 금융자산 6군집 분류</w:t>
-      </w:r>
-    </w:p>
-    <w:p>
-      <w:pPr>
-        <w:spacing w:before="20" w:after="20"/>
-        <w:ind w:left="283"/>
-      </w:pPr>
-      <w:r>
-        <w:rPr>
-          <w:sz w:val="20"/>
-        </w:rPr>
-        <w:t>• 신용평가 예측 : OLS → Random Forest → LSTM 파이프라인 구축, 상장폐지 예측 모형</w:t>
-      </w:r>
-    </w:p>
-    <w:p>
-      <w:pPr>
-        <w:spacing w:before="20" w:after="20"/>
-        <w:ind w:left="283"/>
-      </w:pPr>
-      <w:r>
-        <w:rPr>
-          <w:sz w:val="20"/>
-        </w:rPr>
-        <w:t>• AML 위험 감지 : KNN 기반 자금세탁 의심거래 판별 모델</w:t>
-      </w:r>
-    </w:p>
-    <w:p>
-      <w:pPr>
-        <w:spacing w:before="160"/>
-      </w:pPr>
-      <w:r>
-        <w:rPr>
-          <w:b/>
-          <w:color w:val="2E74B5"/>
-          <w:sz w:val="22"/>
-        </w:rPr>
-        <w:t>OCR &amp; 문서 자동화</w:t>
-      </w:r>
-    </w:p>
-    <w:p>
-      <w:pPr>
-        <w:spacing w:before="20" w:after="20"/>
-        <w:ind w:left="283"/>
-      </w:pPr>
-      <w:r>
-        <w:rPr>
-          <w:sz w:val="20"/>
-        </w:rPr>
-        <w:t>• Tesseract OCR → Ollama(Llama3.1:8B) 파이프라인으로 비정형 문서 → 정형 데이터 자동 변환 시스템 구축</w:t>
-      </w:r>
-    </w:p>
-    <w:p>
-      <w:pPr>
-        <w:spacing w:before="20" w:after="20"/>
-        <w:ind w:left="283"/>
-      </w:pPr>
-      <w:r>
-        <w:rPr>
-          <w:sz w:val="20"/>
-        </w:rPr>
-        <w:t>• 실제 신탁 시스템에 탑재하여 운영 중</w:t>
-      </w:r>
-    </w:p>
-    <w:p>
-      <w:pPr>
-        <w:spacing w:before="160"/>
-      </w:pPr>
-      <w:r>
-        <w:rPr>
-          <w:b/>
-          <w:color w:val="2E74B5"/>
-          <w:sz w:val="22"/>
-        </w:rPr>
-        <w:t>AI 관련 기술 스택</w:t>
-      </w:r>
-    </w:p>
-    <w:p>
-      <w:pPr>
-        <w:ind w:left="283"/>
-      </w:pPr>
-      <w:r>
-        <w:rPr>
-          <w:color w:val="C0392B"/>
-          <w:sz w:val="20"/>
-        </w:rPr>
-        <w:t xml:space="preserve">Python | LangChain | Chroma | OpenAI API (GPT-o1, o3) | Llama (2.0, 3.1) | Qwen | Ollama | LoRA/QLoRA | </w:t>
-      </w:r>
-      <w:r>
-        <w:rPr>
-          <w:color w:val="C0392B"/>
-          <w:sz w:val="20"/>
-        </w:rPr>
-        <w:t>RAG | PEFT | Deep Momentum | k-means | Contrastive Learning | LSTM | Random Forest | KNN | OLS | Tesseract OCR | Flask | Streamlit</w:t>
-      </w:r>
-    </w:p>
-    <w:p>
-      <w:pPr>
-        <w:spacing w:before="240" w:after="80"/>
-      </w:pPr>
-      <w:r>
-        <w:rPr>
-          <w:b/>
-          <w:color w:val="1A3C6E"/>
-          <w:sz w:val="26"/>
-        </w:rPr>
-        <w:t>▶ 학력 사항</w:t>
-      </w:r>
     </w:p>
     <w:tbl>
       <w:tblPr>
         <w:tblStyle w:val="TableGrid"/>
         <w:tblW w:type="auto" w:w="0"/>
+        <w:jc w:val="center"/>
         <w:tblLook w:firstColumn="1" w:firstRow="1" w:lastColumn="0" w:lastRow="0" w:noHBand="0" w:noVBand="1" w:val="04A0"/>
       </w:tblPr>
       <w:tblGrid>
-        <w:gridCol w:w="2493"/>
-        <w:gridCol w:w="2493"/>
-        <w:gridCol w:w="2493"/>
-        <w:gridCol w:w="2493"/>
+        <w:gridCol w:w="2550"/>
+        <w:gridCol w:w="2550"/>
+        <w:gridCol w:w="2550"/>
+        <w:gridCol w:w="2550"/>
       </w:tblGrid>
       <w:tr>
         <w:tc>
           <w:tcPr>
-            <w:tcW w:type="dxa" w:w="2493"/>
+            <w:tcW w:type="dxa" w:w="2550"/>
+            <w:shd w:fill="0D47A1"/>
           </w:tcPr>
           <w:p>
             <w:pPr>
@@ -445,6 +536,7 @@
             <w:r>
               <w:rPr>
                 <w:b/>
+                <w:color w:val="FFFFFF"/>
                 <w:sz w:val="18"/>
               </w:rPr>
               <w:t>기간</w:t>
@@ -453,7 +545,8 @@
         </w:tc>
         <w:tc>
           <w:tcPr>
-            <w:tcW w:type="dxa" w:w="2493"/>
+            <w:tcW w:type="dxa" w:w="2550"/>
+            <w:shd w:fill="0D47A1"/>
           </w:tcPr>
           <w:p>
             <w:pPr>
@@ -462,6 +555,7 @@
             <w:r>
               <w:rPr>
                 <w:b/>
+                <w:color w:val="FFFFFF"/>
                 <w:sz w:val="18"/>
               </w:rPr>
               <w:t>학교</w:t>
@@ -470,7 +564,8 @@
         </w:tc>
         <w:tc>
           <w:tcPr>
-            <w:tcW w:type="dxa" w:w="2493"/>
+            <w:tcW w:type="dxa" w:w="2550"/>
+            <w:shd w:fill="0D47A1"/>
           </w:tcPr>
           <w:p>
             <w:pPr>
@@ -479,6 +574,7 @@
             <w:r>
               <w:rPr>
                 <w:b/>
+                <w:color w:val="FFFFFF"/>
                 <w:sz w:val="18"/>
               </w:rPr>
               <w:t>전공</w:t>
@@ -487,7 +583,8 @@
         </w:tc>
         <w:tc>
           <w:tcPr>
-            <w:tcW w:type="dxa" w:w="2493"/>
+            <w:tcW w:type="dxa" w:w="2550"/>
+            <w:shd w:fill="0D47A1"/>
           </w:tcPr>
           <w:p>
             <w:pPr>
@@ -496,6 +593,7 @@
             <w:r>
               <w:rPr>
                 <w:b/>
+                <w:color w:val="FFFFFF"/>
                 <w:sz w:val="18"/>
               </w:rPr>
               <w:t>구분</w:t>
@@ -506,40 +604,68 @@
       <w:tr>
         <w:tc>
           <w:tcPr>
-            <w:tcW w:type="dxa" w:w="2493"/>
+            <w:tcW w:type="dxa" w:w="2550"/>
+            <w:shd w:fill="E3F2FD"/>
           </w:tcPr>
           <w:p>
+            <w:pPr>
+              <w:jc w:val="center"/>
+            </w:pPr>
             <w:r>
+              <w:rPr>
+                <w:sz w:val="18"/>
+              </w:rPr>
               <w:t>2023.03 ~ 2025.02</w:t>
             </w:r>
           </w:p>
         </w:tc>
         <w:tc>
           <w:tcPr>
-            <w:tcW w:type="dxa" w:w="2493"/>
+            <w:tcW w:type="dxa" w:w="2550"/>
+            <w:shd w:fill="E3F2FD"/>
           </w:tcPr>
           <w:p>
+            <w:pPr>
+              <w:jc w:val="center"/>
+            </w:pPr>
             <w:r>
+              <w:rPr>
+                <w:sz w:val="18"/>
+              </w:rPr>
               <w:t>서강대학교 경제대학원</w:t>
             </w:r>
           </w:p>
         </w:tc>
         <w:tc>
           <w:tcPr>
-            <w:tcW w:type="dxa" w:w="2493"/>
+            <w:tcW w:type="dxa" w:w="2550"/>
+            <w:shd w:fill="E3F2FD"/>
           </w:tcPr>
           <w:p>
+            <w:pPr>
+              <w:jc w:val="center"/>
+            </w:pPr>
             <w:r>
+              <w:rPr>
+                <w:sz w:val="18"/>
+              </w:rPr>
               <w:t>인공지능경제</w:t>
             </w:r>
           </w:p>
         </w:tc>
         <w:tc>
           <w:tcPr>
-            <w:tcW w:type="dxa" w:w="2493"/>
+            <w:tcW w:type="dxa" w:w="2550"/>
+            <w:shd w:fill="E3F2FD"/>
           </w:tcPr>
           <w:p>
+            <w:pPr>
+              <w:jc w:val="center"/>
+            </w:pPr>
             <w:r>
+              <w:rPr>
+                <w:sz w:val="18"/>
+              </w:rPr>
               <w:t>석사 졸업</w:t>
             </w:r>
           </w:p>
@@ -548,40 +674,64 @@
       <w:tr>
         <w:tc>
           <w:tcPr>
-            <w:tcW w:type="dxa" w:w="2493"/>
+            <w:tcW w:type="dxa" w:w="2550"/>
           </w:tcPr>
           <w:p>
+            <w:pPr>
+              <w:jc w:val="center"/>
+            </w:pPr>
             <w:r>
+              <w:rPr>
+                <w:sz w:val="18"/>
+              </w:rPr>
               <w:t>2011.03 ~ 2022.08</w:t>
             </w:r>
           </w:p>
         </w:tc>
         <w:tc>
           <w:tcPr>
-            <w:tcW w:type="dxa" w:w="2493"/>
+            <w:tcW w:type="dxa" w:w="2550"/>
           </w:tcPr>
           <w:p>
+            <w:pPr>
+              <w:jc w:val="center"/>
+            </w:pPr>
             <w:r>
+              <w:rPr>
+                <w:sz w:val="18"/>
+              </w:rPr>
               <w:t>한국방송통신대학교</w:t>
             </w:r>
           </w:p>
         </w:tc>
         <w:tc>
           <w:tcPr>
-            <w:tcW w:type="dxa" w:w="2493"/>
+            <w:tcW w:type="dxa" w:w="2550"/>
           </w:tcPr>
           <w:p>
+            <w:pPr>
+              <w:jc w:val="center"/>
+            </w:pPr>
             <w:r>
+              <w:rPr>
+                <w:sz w:val="18"/>
+              </w:rPr>
               <w:t>컴퓨터과학</w:t>
             </w:r>
           </w:p>
         </w:tc>
         <w:tc>
           <w:tcPr>
-            <w:tcW w:type="dxa" w:w="2493"/>
+            <w:tcW w:type="dxa" w:w="2550"/>
           </w:tcPr>
           <w:p>
+            <w:pPr>
+              <w:jc w:val="center"/>
+            </w:pPr>
             <w:r>
+              <w:rPr>
+                <w:sz w:val="18"/>
+              </w:rPr>
               <w:t>학사 졸업</w:t>
             </w:r>
           </w:p>
@@ -590,39 +740,95 @@
       <w:tr>
         <w:tc>
           <w:tcPr>
-            <w:tcW w:type="dxa" w:w="2493"/>
+            <w:tcW w:type="dxa" w:w="2550"/>
           </w:tcPr>
           <w:p>
-            <w:r/>
+            <w:pPr>
+              <w:jc w:val="center"/>
+            </w:pPr>
+            <w:r>
+              <w:rPr>
+                <w:sz w:val="18"/>
+              </w:rPr>
+            </w:r>
           </w:p>
         </w:tc>
         <w:tc>
           <w:tcPr>
-            <w:tcW w:type="dxa" w:w="2493"/>
+            <w:tcW w:type="dxa" w:w="2550"/>
           </w:tcPr>
           <w:p>
+            <w:pPr>
+              <w:jc w:val="center"/>
+            </w:pPr>
             <w:r>
+              <w:rPr>
+                <w:sz w:val="18"/>
+              </w:rPr>
               <w:t>한성대학교</w:t>
             </w:r>
           </w:p>
         </w:tc>
         <w:tc>
           <w:tcPr>
-            <w:tcW w:type="dxa" w:w="2493"/>
+            <w:tcW w:type="dxa" w:w="2550"/>
           </w:tcPr>
           <w:p>
+            <w:pPr>
+              <w:jc w:val="center"/>
+            </w:pPr>
             <w:r>
+              <w:rPr>
+                <w:sz w:val="18"/>
+              </w:rPr>
               <w:t>소프트웨어시스템</w:t>
             </w:r>
           </w:p>
         </w:tc>
         <w:tc>
           <w:tcPr>
-            <w:tcW w:type="dxa" w:w="2493"/>
+            <w:tcW w:type="dxa" w:w="2550"/>
           </w:tcPr>
           <w:p>
+            <w:pPr>
+              <w:jc w:val="center"/>
+            </w:pPr>
             <w:r>
+              <w:rPr>
+                <w:sz w:val="18"/>
+              </w:rPr>
               <w:t>중퇴</w:t>
+            </w:r>
+          </w:p>
+        </w:tc>
+      </w:tr>
+    </w:tbl>
+    <w:tbl>
+      <w:tblPr>
+        <w:tblW w:type="auto" w:w="0"/>
+        <w:jc w:val="left"/>
+        <w:tblLook w:firstColumn="1" w:firstRow="1" w:lastColumn="0" w:lastRow="0" w:noHBand="0" w:noVBand="1" w:val="04A0"/>
+      </w:tblPr>
+      <w:tblGrid>
+        <w:gridCol w:w="10200"/>
+      </w:tblGrid>
+      <w:tr>
+        <w:tc>
+          <w:tcPr>
+            <w:tcW w:type="dxa" w:w="10200"/>
+            <w:shd w:fill="0D47A1"/>
+          </w:tcPr>
+          <w:p>
+            <w:pPr>
+              <w:spacing w:before="0" w:after="0"/>
+            </w:pPr>
+            <w:r>
+              <w:rPr>
+                <w:b/>
+                <w:color w:val="FFFFFF"/>
+                <w:sz w:val="24"/>
+              </w:rPr>
+              <w:t xml:space="preserve">  📋  자격</w:t>
             </w:r>
           </w:p>
         </w:tc>
@@ -630,1081 +836,2681 @@
     </w:tbl>
     <w:p>
       <w:pPr>
-        <w:spacing w:before="240" w:after="80"/>
+        <w:spacing w:before="40" w:after="40"/>
+      </w:pPr>
+    </w:p>
+    <w:tbl>
+      <w:tblPr>
+        <w:tblStyle w:val="TableGrid"/>
+        <w:tblW w:type="auto" w:w="0"/>
+        <w:jc w:val="center"/>
+        <w:tblLook w:firstColumn="1" w:firstRow="1" w:lastColumn="0" w:lastRow="0" w:noHBand="0" w:noVBand="1" w:val="04A0"/>
+      </w:tblPr>
+      <w:tblGrid>
+        <w:gridCol w:w="2550"/>
+        <w:gridCol w:w="2550"/>
+        <w:gridCol w:w="2550"/>
+        <w:gridCol w:w="2550"/>
+      </w:tblGrid>
+      <w:tr>
+        <w:tc>
+          <w:tcPr>
+            <w:tcW w:type="dxa" w:w="2550"/>
+            <w:shd w:fill="0D47A1"/>
+          </w:tcPr>
+          <w:p>
+            <w:pPr>
+              <w:jc w:val="center"/>
+            </w:pPr>
+            <w:r>
+              <w:rPr>
+                <w:b/>
+                <w:color w:val="FFFFFF"/>
+                <w:sz w:val="18"/>
+              </w:rPr>
+              <w:t>자격명</w:t>
+            </w:r>
+          </w:p>
+        </w:tc>
+        <w:tc>
+          <w:tcPr>
+            <w:tcW w:type="dxa" w:w="2550"/>
+            <w:shd w:fill="0D47A1"/>
+          </w:tcPr>
+          <w:p>
+            <w:pPr>
+              <w:jc w:val="center"/>
+            </w:pPr>
+            <w:r>
+              <w:rPr>
+                <w:b/>
+                <w:color w:val="FFFFFF"/>
+                <w:sz w:val="18"/>
+              </w:rPr>
+              <w:t>발급기관</w:t>
+            </w:r>
+          </w:p>
+        </w:tc>
+        <w:tc>
+          <w:tcPr>
+            <w:tcW w:type="dxa" w:w="2550"/>
+            <w:shd w:fill="0D47A1"/>
+          </w:tcPr>
+          <w:p>
+            <w:pPr>
+              <w:jc w:val="center"/>
+            </w:pPr>
+            <w:r>
+              <w:rPr>
+                <w:b/>
+                <w:color w:val="FFFFFF"/>
+                <w:sz w:val="18"/>
+              </w:rPr>
+              <w:t>취득일</w:t>
+            </w:r>
+          </w:p>
+        </w:tc>
+        <w:tc>
+          <w:tcPr>
+            <w:tcW w:type="dxa" w:w="2550"/>
+            <w:shd w:fill="0D47A1"/>
+          </w:tcPr>
+          <w:p>
+            <w:pPr>
+              <w:jc w:val="center"/>
+            </w:pPr>
+            <w:r>
+              <w:rPr>
+                <w:b/>
+                <w:color w:val="FFFFFF"/>
+                <w:sz w:val="18"/>
+              </w:rPr>
+              <w:t>등록번호</w:t>
+            </w:r>
+          </w:p>
+        </w:tc>
+      </w:tr>
+      <w:tr>
+        <w:tc>
+          <w:tcPr>
+            <w:tcW w:type="dxa" w:w="2550"/>
+          </w:tcPr>
+          <w:p>
+            <w:pPr>
+              <w:jc w:val="center"/>
+            </w:pPr>
+            <w:r>
+              <w:rPr>
+                <w:sz w:val="18"/>
+              </w:rPr>
+              <w:t>정보처리기사</w:t>
+            </w:r>
+          </w:p>
+        </w:tc>
+        <w:tc>
+          <w:tcPr>
+            <w:tcW w:type="dxa" w:w="2550"/>
+          </w:tcPr>
+          <w:p>
+            <w:pPr>
+              <w:jc w:val="center"/>
+            </w:pPr>
+            <w:r>
+              <w:rPr>
+                <w:sz w:val="18"/>
+              </w:rPr>
+              <w:t>한국산업인력공단</w:t>
+            </w:r>
+          </w:p>
+        </w:tc>
+        <w:tc>
+          <w:tcPr>
+            <w:tcW w:type="dxa" w:w="2550"/>
+          </w:tcPr>
+          <w:p>
+            <w:pPr>
+              <w:jc w:val="center"/>
+            </w:pPr>
+            <w:r>
+              <w:rPr>
+                <w:sz w:val="18"/>
+              </w:rPr>
+              <w:t>2003.12.08</w:t>
+            </w:r>
+          </w:p>
+        </w:tc>
+        <w:tc>
+          <w:tcPr>
+            <w:tcW w:type="dxa" w:w="2550"/>
+          </w:tcPr>
+          <w:p>
+            <w:pPr>
+              <w:jc w:val="center"/>
+            </w:pPr>
+            <w:r>
+              <w:rPr>
+                <w:sz w:val="18"/>
+              </w:rPr>
+              <w:t>03204011308W</w:t>
+            </w:r>
+          </w:p>
+        </w:tc>
+      </w:tr>
+      <w:tr>
+        <w:tc>
+          <w:tcPr>
+            <w:tcW w:type="dxa" w:w="2550"/>
+          </w:tcPr>
+          <w:p>
+            <w:pPr>
+              <w:jc w:val="center"/>
+            </w:pPr>
+            <w:r>
+              <w:rPr>
+                <w:sz w:val="18"/>
+              </w:rPr>
+              <w:t>SQLD</w:t>
+            </w:r>
+          </w:p>
+        </w:tc>
+        <w:tc>
+          <w:tcPr>
+            <w:tcW w:type="dxa" w:w="2550"/>
+          </w:tcPr>
+          <w:p>
+            <w:pPr>
+              <w:jc w:val="center"/>
+            </w:pPr>
+            <w:r>
+              <w:rPr>
+                <w:sz w:val="18"/>
+              </w:rPr>
+              <w:t>한국데이터산업진흥원</w:t>
+            </w:r>
+          </w:p>
+        </w:tc>
+        <w:tc>
+          <w:tcPr>
+            <w:tcW w:type="dxa" w:w="2550"/>
+          </w:tcPr>
+          <w:p>
+            <w:pPr>
+              <w:jc w:val="center"/>
+            </w:pPr>
+            <w:r>
+              <w:rPr>
+                <w:sz w:val="18"/>
+              </w:rPr>
+              <w:t>2022.06.22</w:t>
+            </w:r>
+          </w:p>
+        </w:tc>
+        <w:tc>
+          <w:tcPr>
+            <w:tcW w:type="dxa" w:w="2550"/>
+          </w:tcPr>
+          <w:p>
+            <w:pPr>
+              <w:jc w:val="center"/>
+            </w:pPr>
+            <w:r>
+              <w:rPr>
+                <w:sz w:val="18"/>
+              </w:rPr>
+              <w:t>SQLD-045006984</w:t>
+            </w:r>
+          </w:p>
+        </w:tc>
+      </w:tr>
+    </w:tbl>
+    <w:tbl>
+      <w:tblPr>
+        <w:tblW w:type="auto" w:w="0"/>
+        <w:jc w:val="left"/>
+        <w:tblLook w:firstColumn="1" w:firstRow="1" w:lastColumn="0" w:lastRow="0" w:noHBand="0" w:noVBand="1" w:val="04A0"/>
+      </w:tblPr>
+      <w:tblGrid>
+        <w:gridCol w:w="10200"/>
+      </w:tblGrid>
+      <w:tr>
+        <w:tc>
+          <w:tcPr>
+            <w:tcW w:type="dxa" w:w="10200"/>
+            <w:shd w:fill="0D47A1"/>
+          </w:tcPr>
+          <w:p>
+            <w:pPr>
+              <w:spacing w:before="0" w:after="0"/>
+            </w:pPr>
+            <w:r>
+              <w:rPr>
+                <w:b/>
+                <w:color w:val="FFFFFF"/>
+                <w:sz w:val="24"/>
+              </w:rPr>
+              <w:t xml:space="preserve">  💼  주요 경력</w:t>
+            </w:r>
+          </w:p>
+        </w:tc>
+      </w:tr>
+    </w:tbl>
+    <w:p>
+      <w:pPr>
+        <w:spacing w:before="40" w:after="40"/>
+      </w:pPr>
+    </w:p>
+    <w:p>
+      <w:pPr>
+        <w:spacing w:before="160" w:after="40"/>
       </w:pPr>
       <w:r>
         <w:rPr>
           <w:b/>
-          <w:color w:val="1A3C6E"/>
-          <w:sz w:val="26"/>
+          <w:color w:val="212121"/>
+          <w:sz w:val="22"/>
         </w:rPr>
-        <w:t>▶ 자격 사항</w:t>
+        <w:t>Nice Investing</w:t>
+      </w:r>
+      <w:r>
+        <w:rPr>
+          <w:color w:val="616161"/>
+          <w:sz w:val="19"/>
+        </w:rPr>
+        <w:t xml:space="preserve">  |  IT운영실 / INDEX개발실  |  </w:t>
+      </w:r>
+      <w:r>
+        <w:rPr>
+          <w:b/>
+          <w:color w:val="E53935"/>
+          <w:sz w:val="19"/>
+        </w:rPr>
+        <w:t>팀장</w:t>
+      </w:r>
+    </w:p>
+    <w:p>
+      <w:pPr>
+        <w:spacing w:after="60"/>
+      </w:pPr>
+      <w:r>
+        <w:rPr>
+          <w:color w:val="909090"/>
+          <w:sz w:val="18"/>
+        </w:rPr>
+        <w:t>📅 2025.05 ~ 現</w:t>
+      </w:r>
+    </w:p>
+    <w:p>
+      <w:pPr>
+        <w:spacing w:before="40" w:after="80"/>
+        <w:ind w:left="170"/>
+      </w:pPr>
+      <w:r>
+        <w:rPr>
+          <w:b/>
+          <w:color w:val="0D47A1"/>
+          <w:sz w:val="17"/>
+        </w:rPr>
+        <w:t xml:space="preserve"> Agentic AI </w:t>
+      </w:r>
+      <w:r>
+        <w:rPr>
+          <w:sz w:val="17"/>
+        </w:rPr>
+        <w:t xml:space="preserve">  </w:t>
+      </w:r>
+      <w:r>
+        <w:rPr>
+          <w:b/>
+          <w:color w:val="0D47A1"/>
+          <w:sz w:val="17"/>
+        </w:rPr>
+        <w:t xml:space="preserve"> Multi-LLM </w:t>
+      </w:r>
+      <w:r>
+        <w:rPr>
+          <w:sz w:val="17"/>
+        </w:rPr>
+        <w:t xml:space="preserve">  </w:t>
+      </w:r>
+      <w:r>
+        <w:rPr>
+          <w:b/>
+          <w:color w:val="0D47A1"/>
+          <w:sz w:val="17"/>
+        </w:rPr>
+        <w:t xml:space="preserve"> Qwen </w:t>
+      </w:r>
+      <w:r>
+        <w:rPr>
+          <w:sz w:val="17"/>
+        </w:rPr>
+        <w:t xml:space="preserve">  </w:t>
+      </w:r>
+      <w:r>
+        <w:rPr>
+          <w:b/>
+          <w:color w:val="0D47A1"/>
+          <w:sz w:val="17"/>
+        </w:rPr>
+        <w:t xml:space="preserve"> GPT </w:t>
+      </w:r>
+      <w:r>
+        <w:rPr>
+          <w:sz w:val="17"/>
+        </w:rPr>
+        <w:t xml:space="preserve">  </w:t>
+      </w:r>
+      <w:r>
+        <w:rPr>
+          <w:b/>
+          <w:color w:val="0D47A1"/>
+          <w:sz w:val="17"/>
+        </w:rPr>
+        <w:t xml:space="preserve"> Python </w:t>
+      </w:r>
+      <w:r>
+        <w:rPr>
+          <w:sz w:val="17"/>
+        </w:rPr>
+        <w:t xml:space="preserve">  </w:t>
+      </w:r>
+      <w:r>
+        <w:rPr>
+          <w:b/>
+          <w:color w:val="0D47A1"/>
+          <w:sz w:val="17"/>
+        </w:rPr>
+        <w:t xml:space="preserve"> Oracle </w:t>
       </w:r>
     </w:p>
     <w:p>
       <w:pPr>
         <w:spacing w:before="20" w:after="20"/>
-        <w:ind w:left="283"/>
+        <w:ind w:left="227"/>
       </w:pPr>
       <w:r>
         <w:rPr>
-          <w:sz w:val="20"/>
+          <w:color w:val="1E88E5"/>
+          <w:sz w:val="19"/>
         </w:rPr>
-        <w:t>• 정보처리기사 | 03204011308W | 2003.12.08 | 한국산업인력공단</w:t>
+        <w:t xml:space="preserve">▸ </w:t>
+      </w:r>
+      <w:r>
+        <w:rPr>
+          <w:sz w:val="19"/>
+        </w:rPr>
+        <w:t>Agentic AI, Vibe Coding 기반 업무 혁신</w:t>
       </w:r>
     </w:p>
     <w:p>
       <w:pPr>
         <w:spacing w:before="20" w:after="20"/>
-        <w:ind w:left="283"/>
+        <w:ind w:left="227"/>
       </w:pPr>
       <w:r>
         <w:rPr>
-          <w:sz w:val="20"/>
+          <w:color w:val="1E88E5"/>
+          <w:sz w:val="19"/>
         </w:rPr>
-        <w:t>• SQLD | SQLD-045006984 | 2022.06.22 | 한국데이터산업진흥원</w:t>
+        <w:t xml:space="preserve">▸ </w:t>
       </w:r>
-    </w:p>
-    <w:p>
-      <w:pPr>
-        <w:spacing w:before="240" w:after="80"/>
-      </w:pPr>
       <w:r>
         <w:rPr>
-          <w:b/>
-          <w:color w:val="1A3C6E"/>
-          <w:sz w:val="26"/>
+          <w:sz w:val="19"/>
         </w:rPr>
-        <w:t>▶ 주요 경력</w:t>
-      </w:r>
-    </w:p>
-    <w:p>
-      <w:pPr>
-        <w:spacing w:before="160"/>
-      </w:pPr>
-      <w:r>
-        <w:rPr>
-          <w:b/>
-          <w:color w:val="1A3C6E"/>
-          <w:sz w:val="22"/>
-        </w:rPr>
-        <w:t>Nice Investing | IT운영실 / INDEX개발실 | 팀장</w:t>
-      </w:r>
-    </w:p>
-    <w:p>
-      <w:r>
-        <w:rPr>
-          <w:b w:val="0"/>
-          <w:color w:val="7F8C8D"/>
-          <w:sz w:val="20"/>
-        </w:rPr>
-        <w:t>2025.05 ~ 現</w:t>
+        <w:t>KIND, DART, SeiBro 공시 데이터 자동 수집 → Multi-LLM(Qwen+GPT)으로 구조화 JSON 추출</w:t>
       </w:r>
     </w:p>
     <w:p>
       <w:pPr>
         <w:spacing w:before="20" w:after="20"/>
-        <w:ind w:left="283"/>
+        <w:ind w:left="227"/>
       </w:pPr>
       <w:r>
         <w:rPr>
-          <w:sz w:val="20"/>
+          <w:color w:val="1E88E5"/>
+          <w:sz w:val="19"/>
         </w:rPr>
-        <w:t>• Agentic AI, Vibe Coding 기반 업무 혁신</w:t>
+        <w:t xml:space="preserve">▸ </w:t>
+      </w:r>
+      <w:r>
+        <w:rPr>
+          <w:sz w:val="19"/>
+        </w:rPr>
+        <w:t>산업분류 클러스터링 및 인덱스 엔진 개발</w:t>
       </w:r>
     </w:p>
     <w:p>
       <w:pPr>
         <w:spacing w:before="20" w:after="20"/>
-        <w:ind w:left="283"/>
+        <w:ind w:left="227"/>
       </w:pPr>
       <w:r>
         <w:rPr>
-          <w:sz w:val="20"/>
+          <w:color w:val="1E88E5"/>
+          <w:sz w:val="19"/>
         </w:rPr>
-        <w:t>• KIND, DART, SeiBro 공시 데이터 자동 수집 → Multi-LLM(Qwen+GPT)으로 구조화 JSON 추출</w:t>
+        <w:t xml:space="preserve">▸ </w:t>
+      </w:r>
+      <w:r>
+        <w:rPr>
+          <w:sz w:val="19"/>
+        </w:rPr>
+        <w:t>LLM 기반 테마 추출 → 테마 액티브 인덱스 개발</w:t>
       </w:r>
     </w:p>
     <w:p>
       <w:pPr>
         <w:spacing w:before="20" w:after="20"/>
-        <w:ind w:left="283"/>
+        <w:ind w:left="227"/>
       </w:pPr>
       <w:r>
         <w:rPr>
-          <w:sz w:val="20"/>
+          <w:color w:val="1E88E5"/>
+          <w:sz w:val="19"/>
         </w:rPr>
-        <w:t>• 산업분류 클러스터링 및 인덱스 엔진 개발</w:t>
+        <w:t xml:space="preserve">▸ </w:t>
+      </w:r>
+      <w:r>
+        <w:rPr>
+          <w:sz w:val="19"/>
+        </w:rPr>
+        <w:t>자산배분, 성과요인분해, 멀티팩터모델 운영</w:t>
       </w:r>
     </w:p>
     <w:p>
       <w:pPr>
         <w:spacing w:before="20" w:after="20"/>
-        <w:ind w:left="283"/>
+        <w:ind w:left="227"/>
       </w:pPr>
       <w:r>
         <w:rPr>
-          <w:sz w:val="20"/>
+          <w:color w:val="1E88E5"/>
+          <w:sz w:val="19"/>
         </w:rPr>
-        <w:t>• LLM 기반 테마 추출 → 테마 액티브 인덱스 개발</w:t>
+        <w:t xml:space="preserve">▸ </w:t>
+      </w:r>
+      <w:r>
+        <w:rPr>
+          <w:sz w:val="19"/>
+        </w:rPr>
+        <w:t>자본시장DB 데이터 사업, 레포트/컨센서스 수집, 인사이트 도출</w:t>
+      </w:r>
+    </w:p>
+    <w:p>
+      <w:pPr>
+        <w:spacing w:before="40" w:after="40"/>
+      </w:pPr>
+      <w:r>
+        <w:rPr>
+          <w:color w:val="E0E0E0"/>
+          <w:sz w:val="10"/>
+        </w:rPr>
+        <w:t>───────────────────────────────────────────────────────────────────────────</w:t>
+      </w:r>
+    </w:p>
+    <w:p>
+      <w:pPr>
+        <w:spacing w:before="160" w:after="40"/>
+      </w:pPr>
+      <w:r>
+        <w:rPr>
+          <w:b/>
+          <w:color w:val="212121"/>
+          <w:sz w:val="22"/>
+        </w:rPr>
+        <w:t>FinancialDataSystem</w:t>
+      </w:r>
+      <w:r>
+        <w:rPr>
+          <w:color w:val="616161"/>
+          <w:sz w:val="19"/>
+        </w:rPr>
+        <w:t xml:space="preserve">  |  인공지능TFT  |  </w:t>
+      </w:r>
+      <w:r>
+        <w:rPr>
+          <w:b/>
+          <w:color w:val="E53935"/>
+          <w:sz w:val="19"/>
+        </w:rPr>
+        <w:t>수석</w:t>
+      </w:r>
+    </w:p>
+    <w:p>
+      <w:pPr>
+        <w:spacing w:after="60"/>
+      </w:pPr>
+      <w:r>
+        <w:rPr>
+          <w:color w:val="909090"/>
+          <w:sz w:val="18"/>
+        </w:rPr>
+        <w:t>📅 2025.01 ~ 2025.04</w:t>
+      </w:r>
+    </w:p>
+    <w:p>
+      <w:pPr>
+        <w:spacing w:before="40" w:after="80"/>
+        <w:ind w:left="170"/>
+      </w:pPr>
+      <w:r>
+        <w:rPr>
+          <w:b/>
+          <w:color w:val="0D47A1"/>
+          <w:sz w:val="17"/>
+        </w:rPr>
+        <w:t xml:space="preserve"> OCR </w:t>
+      </w:r>
+      <w:r>
+        <w:rPr>
+          <w:sz w:val="17"/>
+        </w:rPr>
+        <w:t xml:space="preserve">  </w:t>
+      </w:r>
+      <w:r>
+        <w:rPr>
+          <w:b/>
+          <w:color w:val="0D47A1"/>
+          <w:sz w:val="17"/>
+        </w:rPr>
+        <w:t xml:space="preserve"> Llama3.1 </w:t>
+      </w:r>
+      <w:r>
+        <w:rPr>
+          <w:sz w:val="17"/>
+        </w:rPr>
+        <w:t xml:space="preserve">  </w:t>
+      </w:r>
+      <w:r>
+        <w:rPr>
+          <w:b/>
+          <w:color w:val="0D47A1"/>
+          <w:sz w:val="17"/>
+        </w:rPr>
+        <w:t xml:space="preserve"> LoRA </w:t>
+      </w:r>
+      <w:r>
+        <w:rPr>
+          <w:sz w:val="17"/>
+        </w:rPr>
+        <w:t xml:space="preserve">  </w:t>
+      </w:r>
+      <w:r>
+        <w:rPr>
+          <w:b/>
+          <w:color w:val="0D47A1"/>
+          <w:sz w:val="17"/>
+        </w:rPr>
+        <w:t xml:space="preserve"> QLoRA </w:t>
+      </w:r>
+      <w:r>
+        <w:rPr>
+          <w:sz w:val="17"/>
+        </w:rPr>
+        <w:t xml:space="preserve">  </w:t>
+      </w:r>
+      <w:r>
+        <w:rPr>
+          <w:b/>
+          <w:color w:val="0D47A1"/>
+          <w:sz w:val="17"/>
+        </w:rPr>
+        <w:t xml:space="preserve"> PEFT </w:t>
+      </w:r>
+      <w:r>
+        <w:rPr>
+          <w:sz w:val="17"/>
+        </w:rPr>
+        <w:t xml:space="preserve">  </w:t>
+      </w:r>
+      <w:r>
+        <w:rPr>
+          <w:b/>
+          <w:color w:val="0D47A1"/>
+          <w:sz w:val="17"/>
+        </w:rPr>
+        <w:t xml:space="preserve"> Flask </w:t>
+      </w:r>
+      <w:r>
+        <w:rPr>
+          <w:sz w:val="17"/>
+        </w:rPr>
+        <w:t xml:space="preserve">  </w:t>
+      </w:r>
+      <w:r>
+        <w:rPr>
+          <w:b/>
+          <w:color w:val="0D47A1"/>
+          <w:sz w:val="17"/>
+        </w:rPr>
+        <w:t xml:space="preserve"> Oracle </w:t>
       </w:r>
     </w:p>
     <w:p>
       <w:pPr>
         <w:spacing w:before="20" w:after="20"/>
-        <w:ind w:left="283"/>
+        <w:ind w:left="227"/>
       </w:pPr>
       <w:r>
         <w:rPr>
-          <w:sz w:val="20"/>
+          <w:color w:val="1E88E5"/>
+          <w:sz w:val="19"/>
         </w:rPr>
-        <w:t>• 자산배분, 성과요인분해, 멀티팩터모델 운영</w:t>
+        <w:t xml:space="preserve">▸ </w:t>
+      </w:r>
+      <w:r>
+        <w:rPr>
+          <w:sz w:val="19"/>
+        </w:rPr>
+        <w:t>OCR 기반 문서 데이터화 : Tesseract → Ollama(Llama3.1:8B) → Oracle DB 적재, Flask 시각화</w:t>
       </w:r>
     </w:p>
     <w:p>
       <w:pPr>
         <w:spacing w:before="20" w:after="20"/>
-        <w:ind w:left="283"/>
+        <w:ind w:left="227"/>
       </w:pPr>
       <w:r>
         <w:rPr>
-          <w:sz w:val="20"/>
+          <w:color w:val="1E88E5"/>
+          <w:sz w:val="19"/>
         </w:rPr>
-        <w:t>• 자본시장DB 데이터 사업, 레포트/컨센서스 수집, 인사이트 도출</w:t>
+        <w:t xml:space="preserve">▸ </w:t>
+      </w:r>
+      <w:r>
+        <w:rPr>
+          <w:sz w:val="19"/>
+        </w:rPr>
+        <w:t>신탁계약 약관 챗봇 : PEFT(LoRA vs QLoRA) 비교 연구 → 도메인 특화 LLM 파인튜닝</w:t>
       </w:r>
     </w:p>
     <w:p>
       <w:pPr>
-        <w:spacing w:before="160"/>
+        <w:spacing w:before="40" w:after="40"/>
+      </w:pPr>
+      <w:r>
+        <w:rPr>
+          <w:color w:val="E0E0E0"/>
+          <w:sz w:val="10"/>
+        </w:rPr>
+        <w:t>───────────────────────────────────────────────────────────────────────────</w:t>
+      </w:r>
+    </w:p>
+    <w:p>
+      <w:pPr>
+        <w:spacing w:before="160" w:after="40"/>
       </w:pPr>
       <w:r>
         <w:rPr>
           <w:b/>
-          <w:color w:val="1A3C6E"/>
+          <w:color w:val="212121"/>
           <w:sz w:val="22"/>
         </w:rPr>
-        <w:t>FinancialDataSystem | 인공지능TFT | 수석</w:t>
+        <w:t>FnDataLab</w:t>
+      </w:r>
+      <w:r>
+        <w:rPr>
+          <w:color w:val="616161"/>
+          <w:sz w:val="19"/>
+        </w:rPr>
+        <w:t xml:space="preserve">  |  금융사업부  |  </w:t>
+      </w:r>
+      <w:r>
+        <w:rPr>
+          <w:b/>
+          <w:color w:val="E53935"/>
+          <w:sz w:val="19"/>
+        </w:rPr>
+        <w:t>수석</w:t>
       </w:r>
     </w:p>
     <w:p>
+      <w:pPr>
+        <w:spacing w:after="60"/>
+      </w:pPr>
       <w:r>
         <w:rPr>
-          <w:b w:val="0"/>
-          <w:color w:val="7F8C8D"/>
-          <w:sz w:val="20"/>
+          <w:color w:val="909090"/>
+          <w:sz w:val="18"/>
         </w:rPr>
-        <w:t>2025.01 ~ 2025.04</w:t>
+        <w:t>📅 2023.02 ~ 2024.12</w:t>
+      </w:r>
+    </w:p>
+    <w:p>
+      <w:pPr>
+        <w:spacing w:before="40" w:after="80"/>
+        <w:ind w:left="170"/>
+      </w:pPr>
+      <w:r>
+        <w:rPr>
+          <w:b/>
+          <w:color w:val="0D47A1"/>
+          <w:sz w:val="17"/>
+        </w:rPr>
+        <w:t xml:space="preserve"> RAG </w:t>
+      </w:r>
+      <w:r>
+        <w:rPr>
+          <w:sz w:val="17"/>
+        </w:rPr>
+        <w:t xml:space="preserve">  </w:t>
+      </w:r>
+      <w:r>
+        <w:rPr>
+          <w:b/>
+          <w:color w:val="0D47A1"/>
+          <w:sz w:val="17"/>
+        </w:rPr>
+        <w:t xml:space="preserve"> LangChain </w:t>
+      </w:r>
+      <w:r>
+        <w:rPr>
+          <w:sz w:val="17"/>
+        </w:rPr>
+        <w:t xml:space="preserve">  </w:t>
+      </w:r>
+      <w:r>
+        <w:rPr>
+          <w:b/>
+          <w:color w:val="0D47A1"/>
+          <w:sz w:val="17"/>
+        </w:rPr>
+        <w:t xml:space="preserve"> Chroma </w:t>
+      </w:r>
+      <w:r>
+        <w:rPr>
+          <w:sz w:val="17"/>
+        </w:rPr>
+        <w:t xml:space="preserve">  </w:t>
+      </w:r>
+      <w:r>
+        <w:rPr>
+          <w:b/>
+          <w:color w:val="0D47A1"/>
+          <w:sz w:val="17"/>
+        </w:rPr>
+        <w:t xml:space="preserve"> Llama </w:t>
+      </w:r>
+      <w:r>
+        <w:rPr>
+          <w:sz w:val="17"/>
+        </w:rPr>
+        <w:t xml:space="preserve">  </w:t>
+      </w:r>
+      <w:r>
+        <w:rPr>
+          <w:b/>
+          <w:color w:val="0D47A1"/>
+          <w:sz w:val="17"/>
+        </w:rPr>
+        <w:t xml:space="preserve"> GPT </w:t>
+      </w:r>
+      <w:r>
+        <w:rPr>
+          <w:sz w:val="17"/>
+        </w:rPr>
+        <w:t xml:space="preserve">  </w:t>
+      </w:r>
+      <w:r>
+        <w:rPr>
+          <w:b/>
+          <w:color w:val="0D47A1"/>
+          <w:sz w:val="17"/>
+        </w:rPr>
+        <w:t xml:space="preserve"> Deep Momentum </w:t>
+      </w:r>
+      <w:r>
+        <w:rPr>
+          <w:sz w:val="17"/>
+        </w:rPr>
+        <w:t xml:space="preserve">  </w:t>
+      </w:r>
+      <w:r>
+        <w:rPr>
+          <w:b/>
+          <w:color w:val="0D47A1"/>
+          <w:sz w:val="17"/>
+        </w:rPr>
+        <w:t xml:space="preserve"> K-Means </w:t>
+      </w:r>
+      <w:r>
+        <w:rPr>
+          <w:sz w:val="17"/>
+        </w:rPr>
+        <w:t xml:space="preserve">  </w:t>
+      </w:r>
+      <w:r>
+        <w:rPr>
+          <w:b/>
+          <w:color w:val="0D47A1"/>
+          <w:sz w:val="17"/>
+        </w:rPr>
+        <w:t xml:space="preserve"> Python </w:t>
       </w:r>
     </w:p>
     <w:p>
       <w:pPr>
         <w:spacing w:before="20" w:after="20"/>
-        <w:ind w:left="283"/>
+        <w:ind w:left="227"/>
       </w:pPr>
       <w:r>
         <w:rPr>
-          <w:sz w:val="20"/>
+          <w:color w:val="1E88E5"/>
+          <w:sz w:val="19"/>
         </w:rPr>
-        <w:t>• OCR 기반 문서 데이터화 : Tesseract → Ollama(Llama3.1:8B)로 비정형 문서 정형화 → Oracle DB 적재, Flask 시각화</w:t>
+        <w:t xml:space="preserve">▸ </w:t>
+      </w:r>
+      <w:r>
+        <w:rPr>
+          <w:sz w:val="19"/>
+        </w:rPr>
+        <w:t>한국퇴직연금포털(korpension.com) : Python, Oracle, Shell 기반 데이터 산출 배치</w:t>
       </w:r>
     </w:p>
     <w:p>
       <w:pPr>
         <w:spacing w:before="20" w:after="20"/>
-        <w:ind w:left="283"/>
+        <w:ind w:left="227"/>
       </w:pPr>
       <w:r>
         <w:rPr>
-          <w:sz w:val="20"/>
+          <w:color w:val="1E88E5"/>
+          <w:sz w:val="19"/>
         </w:rPr>
-        <w:t>• 신탁계약 약관 챗봇 : PEFT(LoRA vs QLoRA) 비교 연구를 통한 도메인 특화 LLM 파인튜닝</w:t>
+        <w:t xml:space="preserve">▸ </w:t>
       </w:r>
-    </w:p>
-    <w:p>
-      <w:pPr>
-        <w:spacing w:before="160"/>
-      </w:pPr>
       <w:r>
         <w:rPr>
-          <w:b/>
-          <w:color w:val="1A3C6E"/>
-          <w:sz w:val="22"/>
+          <w:sz w:val="19"/>
         </w:rPr>
-        <w:t>FnDataLab | 금융사업부 | 수석</w:t>
-      </w:r>
-    </w:p>
-    <w:p>
-      <w:r>
-        <w:rPr>
-          <w:b w:val="0"/>
-          <w:color w:val="7F8C8D"/>
-          <w:sz w:val="20"/>
-        </w:rPr>
-        <w:t>2023.02 ~ 2024.12</w:t>
+        <w:t>퇴직연금 디폴트옵션 자산배분 챗봇 : Llama + Chroma + LangChain RAG</w:t>
       </w:r>
     </w:p>
     <w:p>
       <w:pPr>
         <w:spacing w:before="20" w:after="20"/>
-        <w:ind w:left="283"/>
+        <w:ind w:left="227"/>
       </w:pPr>
       <w:r>
         <w:rPr>
-          <w:sz w:val="20"/>
+          <w:color w:val="1E88E5"/>
+          <w:sz w:val="19"/>
         </w:rPr>
-        <w:t>• 한국퇴직연금포털(korpension.com) : Python, Oracle, Shell 기반 데이터 산출 배치, 금감원/통계청 API 크롤링</w:t>
+        <w:t xml:space="preserve">▸ </w:t>
+      </w:r>
+      <w:r>
+        <w:rPr>
+          <w:sz w:val="19"/>
+        </w:rPr>
+        <w:t>글로벌 자산 위험군 클러스터링 (한양대 산학과제) : Contrastive/K-Means, Deep Momentum</w:t>
       </w:r>
     </w:p>
     <w:p>
       <w:pPr>
         <w:spacing w:before="20" w:after="20"/>
-        <w:ind w:left="283"/>
+        <w:ind w:left="227"/>
       </w:pPr>
       <w:r>
         <w:rPr>
-          <w:sz w:val="20"/>
+          <w:color w:val="1E88E5"/>
+          <w:sz w:val="19"/>
         </w:rPr>
-        <w:t>• 퇴직연금 디폴트옵션 자산배분 챗봇 : Llama + Chroma + LangChain RAG 기반 기업별 DC운용 제안 챗봇</w:t>
+        <w:t xml:space="preserve">▸ </w:t>
+      </w:r>
+      <w:r>
+        <w:rPr>
+          <w:sz w:val="19"/>
+        </w:rPr>
+        <w:t>퇴직연금가이드포털(B2C) : Chroma RAG + OpenAI-o3/Llama2.0 듀얼 LLM + Highcharts</w:t>
       </w:r>
     </w:p>
     <w:p>
       <w:pPr>
         <w:spacing w:before="20" w:after="20"/>
-        <w:ind w:left="283"/>
+        <w:ind w:left="227"/>
       </w:pPr>
       <w:r>
         <w:rPr>
-          <w:sz w:val="20"/>
+          <w:color w:val="1E88E5"/>
+          <w:sz w:val="19"/>
         </w:rPr>
-        <w:t>• 글로벌 자산 위험군 클러스터링 (한양대 산업공학부 산학과제) : Contrastive/K-Means 기반 25개 위험지표 클러스터링 → Deep Momentum 포트폴리오</w:t>
+        <w:t xml:space="preserve">▸ </w:t>
+      </w:r>
+      <w:r>
+        <w:rPr>
+          <w:sz w:val="19"/>
+        </w:rPr>
+        <w:t>고객문의 / 기관컨설팅 제안서 챗봇 : GPT + Chroma RAG</w:t>
       </w:r>
     </w:p>
     <w:p>
       <w:pPr>
         <w:spacing w:before="20" w:after="20"/>
-        <w:ind w:left="283"/>
+        <w:ind w:left="227"/>
       </w:pPr>
       <w:r>
         <w:rPr>
-          <w:sz w:val="20"/>
+          <w:color w:val="1E88E5"/>
+          <w:sz w:val="19"/>
         </w:rPr>
-        <w:t>• 글로벌 금융자산 자산배분 (한양대 산학과제) : Deep Momentum 모델, 2000년부터 10년씩 롤링 강화학습</w:t>
+        <w:t xml:space="preserve">▸ </w:t>
+      </w:r>
+      <w:r>
+        <w:rPr>
+          <w:sz w:val="19"/>
+        </w:rPr>
+        <w:t>디폴트옵션 분석 : Python, Pro*C, Shell 배치, 고용노동부/금감원 크롤링</w:t>
+      </w:r>
+    </w:p>
+    <w:p>
+      <w:pPr>
+        <w:spacing w:before="40" w:after="40"/>
+      </w:pPr>
+      <w:r>
+        <w:rPr>
+          <w:color w:val="E0E0E0"/>
+          <w:sz w:val="10"/>
+        </w:rPr>
+        <w:t>───────────────────────────────────────────────────────────────────────────</w:t>
+      </w:r>
+    </w:p>
+    <w:p>
+      <w:pPr>
+        <w:spacing w:before="160" w:after="40"/>
+      </w:pPr>
+      <w:r>
+        <w:rPr>
+          <w:b/>
+          <w:color w:val="212121"/>
+          <w:sz w:val="22"/>
+        </w:rPr>
+        <w:t>FnGuide</w:t>
+      </w:r>
+      <w:r>
+        <w:rPr>
+          <w:color w:val="616161"/>
+          <w:sz w:val="19"/>
+        </w:rPr>
+        <w:t xml:space="preserve">  |  투자플랫폼실  |  </w:t>
+      </w:r>
+      <w:r>
+        <w:rPr>
+          <w:b/>
+          <w:color w:val="E53935"/>
+          <w:sz w:val="19"/>
+        </w:rPr>
+        <w:t>차장</w:t>
+      </w:r>
+    </w:p>
+    <w:p>
+      <w:pPr>
+        <w:spacing w:after="60"/>
+      </w:pPr>
+      <w:r>
+        <w:rPr>
+          <w:color w:val="909090"/>
+          <w:sz w:val="18"/>
+        </w:rPr>
+        <w:t>📅 2020.02 ~ 2023.01</w:t>
+      </w:r>
+    </w:p>
+    <w:p>
+      <w:pPr>
+        <w:spacing w:before="40" w:after="80"/>
+        <w:ind w:left="170"/>
+      </w:pPr>
+      <w:r>
+        <w:rPr>
+          <w:b/>
+          <w:color w:val="0D47A1"/>
+          <w:sz w:val="17"/>
+        </w:rPr>
+        <w:t xml:space="preserve"> Pro*C </w:t>
+      </w:r>
+      <w:r>
+        <w:rPr>
+          <w:sz w:val="17"/>
+        </w:rPr>
+        <w:t xml:space="preserve">  </w:t>
+      </w:r>
+      <w:r>
+        <w:rPr>
+          <w:b/>
+          <w:color w:val="0D47A1"/>
+          <w:sz w:val="17"/>
+        </w:rPr>
+        <w:t xml:space="preserve"> Oracle </w:t>
+      </w:r>
+      <w:r>
+        <w:rPr>
+          <w:sz w:val="17"/>
+        </w:rPr>
+        <w:t xml:space="preserve">  </w:t>
+      </w:r>
+      <w:r>
+        <w:rPr>
+          <w:b/>
+          <w:color w:val="0D47A1"/>
+          <w:sz w:val="17"/>
+        </w:rPr>
+        <w:t xml:space="preserve"> R </w:t>
+      </w:r>
+      <w:r>
+        <w:rPr>
+          <w:sz w:val="17"/>
+        </w:rPr>
+        <w:t xml:space="preserve">  </w:t>
+      </w:r>
+      <w:r>
+        <w:rPr>
+          <w:b/>
+          <w:color w:val="0D47A1"/>
+          <w:sz w:val="17"/>
+        </w:rPr>
+        <w:t xml:space="preserve"> Python </w:t>
+      </w:r>
+      <w:r>
+        <w:rPr>
+          <w:sz w:val="17"/>
+        </w:rPr>
+        <w:t xml:space="preserve">  </w:t>
+      </w:r>
+      <w:r>
+        <w:rPr>
+          <w:b/>
+          <w:color w:val="0D47A1"/>
+          <w:sz w:val="17"/>
+        </w:rPr>
+        <w:t xml:space="preserve"> Spotfire </w:t>
+      </w:r>
+      <w:r>
+        <w:rPr>
+          <w:sz w:val="17"/>
+        </w:rPr>
+        <w:t xml:space="preserve">  </w:t>
+      </w:r>
+      <w:r>
+        <w:rPr>
+          <w:b/>
+          <w:color w:val="0D47A1"/>
+          <w:sz w:val="17"/>
+        </w:rPr>
+        <w:t xml:space="preserve"> R-shiny </w:t>
       </w:r>
     </w:p>
     <w:p>
       <w:pPr>
         <w:spacing w:before="20" w:after="20"/>
-        <w:ind w:left="283"/>
+        <w:ind w:left="227"/>
       </w:pPr>
       <w:r>
         <w:rPr>
-          <w:sz w:val="20"/>
+          <w:color w:val="1E88E5"/>
+          <w:sz w:val="19"/>
         </w:rPr>
-        <w:t>• 퇴직연금가이드포털(B2C) : Chroma + LangChain RAG, OpenAI-o3/Llama2.0 듀얼 LLM, Highcharts + Streamlit 시각화</w:t>
+        <w:t xml:space="preserve">▸ </w:t>
+      </w:r>
+      <w:r>
+        <w:rPr>
+          <w:sz w:val="19"/>
+        </w:rPr>
+        <w:t>PFGuide OCIO 위탁펀드평가 시스템 : 자산배분(MVO, Black-Litterman) + 성과요인분해(Brinson, Lehmann, Campisi)</w:t>
       </w:r>
     </w:p>
     <w:p>
       <w:pPr>
         <w:spacing w:before="20" w:after="20"/>
-        <w:ind w:left="283"/>
+        <w:ind w:left="227"/>
       </w:pPr>
       <w:r>
         <w:rPr>
-          <w:sz w:val="20"/>
+          <w:color w:val="1E88E5"/>
+          <w:sz w:val="19"/>
         </w:rPr>
-        <w:t>• 고객문의 챗봇 / 기관컨설팅 제안서 챗봇 : GPT + Chroma RAG 시스템</w:t>
+        <w:t xml:space="preserve">▸ </w:t>
+      </w:r>
+      <w:r>
+        <w:rPr>
+          <w:sz w:val="19"/>
+        </w:rPr>
+        <w:t>Spotfire BI 개발/서버관리, R-shiny 배치 모니터링, ESG 유니버스 크롤링</w:t>
       </w:r>
     </w:p>
     <w:p>
       <w:pPr>
         <w:spacing w:before="20" w:after="20"/>
-        <w:ind w:left="283"/>
+        <w:ind w:left="227"/>
       </w:pPr>
       <w:r>
         <w:rPr>
-          <w:sz w:val="20"/>
+          <w:color w:val="1E88E5"/>
+          <w:sz w:val="19"/>
         </w:rPr>
-        <w:t>• 디폴트옵션 분석 : Python, Pro*C, Shell 기반 배치, 고용노동부/금감원 크롤링</w:t>
+        <w:t xml:space="preserve">▸ </w:t>
+      </w:r>
+      <w:r>
+        <w:rPr>
+          <w:sz w:val="19"/>
+        </w:rPr>
+        <w:t>대체투자 분석 시스템(fnaims.co.kr) : DB모델링 및 전체 배치 개발</w:t>
       </w:r>
     </w:p>
     <w:p>
       <w:pPr>
-        <w:spacing w:before="160"/>
+        <w:spacing w:before="40" w:after="40"/>
+      </w:pPr>
+      <w:r>
+        <w:rPr>
+          <w:color w:val="E0E0E0"/>
+          <w:sz w:val="10"/>
+        </w:rPr>
+        <w:t>───────────────────────────────────────────────────────────────────────────</w:t>
+      </w:r>
+    </w:p>
+    <w:p>
+      <w:pPr>
+        <w:spacing w:before="160" w:after="40"/>
       </w:pPr>
       <w:r>
         <w:rPr>
           <w:b/>
-          <w:color w:val="1A3C6E"/>
+          <w:color w:val="212121"/>
           <w:sz w:val="22"/>
         </w:rPr>
-        <w:t>FnGuide | 투자플랫폼실 | 차장</w:t>
+        <w:t>FnGuide</w:t>
+      </w:r>
+      <w:r>
+        <w:rPr>
+          <w:color w:val="616161"/>
+          <w:sz w:val="19"/>
+        </w:rPr>
+        <w:t xml:space="preserve">  |  IT전략본부  |  </w:t>
+      </w:r>
+      <w:r>
+        <w:rPr>
+          <w:b/>
+          <w:color w:val="E53935"/>
+          <w:sz w:val="19"/>
+        </w:rPr>
+        <w:t>차장</w:t>
       </w:r>
     </w:p>
     <w:p>
+      <w:pPr>
+        <w:spacing w:after="60"/>
+      </w:pPr>
       <w:r>
         <w:rPr>
-          <w:b w:val="0"/>
-          <w:color w:val="7F8C8D"/>
-          <w:sz w:val="20"/>
+          <w:color w:val="909090"/>
+          <w:sz w:val="18"/>
         </w:rPr>
-        <w:t>2020.02 ~ 2023.01</w:t>
+        <w:t>📅 2017.12 ~ 2020.01</w:t>
+      </w:r>
+    </w:p>
+    <w:p>
+      <w:pPr>
+        <w:spacing w:before="40" w:after="80"/>
+        <w:ind w:left="170"/>
+      </w:pPr>
+      <w:r>
+        <w:rPr>
+          <w:b/>
+          <w:color w:val="0D47A1"/>
+          <w:sz w:val="17"/>
+        </w:rPr>
+        <w:t xml:space="preserve"> Xplatform </w:t>
+      </w:r>
+      <w:r>
+        <w:rPr>
+          <w:sz w:val="17"/>
+        </w:rPr>
+        <w:t xml:space="preserve">  </w:t>
+      </w:r>
+      <w:r>
+        <w:rPr>
+          <w:b/>
+          <w:color w:val="0D47A1"/>
+          <w:sz w:val="17"/>
+        </w:rPr>
+        <w:t xml:space="preserve"> Proframe </w:t>
+      </w:r>
+      <w:r>
+        <w:rPr>
+          <w:sz w:val="17"/>
+        </w:rPr>
+        <w:t xml:space="preserve">  </w:t>
+      </w:r>
+      <w:r>
+        <w:rPr>
+          <w:b/>
+          <w:color w:val="0D47A1"/>
+          <w:sz w:val="17"/>
+        </w:rPr>
+        <w:t xml:space="preserve"> R </w:t>
+      </w:r>
+      <w:r>
+        <w:rPr>
+          <w:sz w:val="17"/>
+        </w:rPr>
+        <w:t xml:space="preserve">  </w:t>
+      </w:r>
+      <w:r>
+        <w:rPr>
+          <w:b/>
+          <w:color w:val="0D47A1"/>
+          <w:sz w:val="17"/>
+        </w:rPr>
+        <w:t xml:space="preserve"> Oracle </w:t>
       </w:r>
     </w:p>
     <w:p>
       <w:pPr>
         <w:spacing w:before="20" w:after="20"/>
-        <w:ind w:left="283"/>
+        <w:ind w:left="227"/>
       </w:pPr>
       <w:r>
         <w:rPr>
-          <w:sz w:val="20"/>
+          <w:color w:val="1E88E5"/>
+          <w:sz w:val="19"/>
         </w:rPr>
-        <w:t>• PFGuide 위탁펀드평가 OCIO 시스템 (pfguide.co.kr) : Pro*C, Oracle, R, Python</w:t>
+        <w:t xml:space="preserve">▸ </w:t>
+      </w:r>
+      <w:r>
+        <w:rPr>
+          <w:sz w:val="19"/>
+        </w:rPr>
+        <w:t>국민연금 정보분석 고도화 : Xplatform, Proframe(C), RD 보고서, R 기반 성과위험지표 배치</w:t>
+      </w:r>
+    </w:p>
+    <w:p>
+      <w:pPr>
+        <w:spacing w:before="40" w:after="40"/>
+      </w:pPr>
+      <w:r>
+        <w:rPr>
+          <w:color w:val="E0E0E0"/>
+          <w:sz w:val="10"/>
+        </w:rPr>
+        <w:t>───────────────────────────────────────────────────────────────────────────</w:t>
+      </w:r>
+    </w:p>
+    <w:p>
+      <w:pPr>
+        <w:spacing w:before="160" w:after="40"/>
+      </w:pPr>
+      <w:r>
+        <w:rPr>
+          <w:b/>
+          <w:color w:val="212121"/>
+          <w:sz w:val="22"/>
+        </w:rPr>
+        <w:t>FnPricing</w:t>
+      </w:r>
+      <w:r>
+        <w:rPr>
+          <w:color w:val="616161"/>
+          <w:sz w:val="19"/>
+        </w:rPr>
+        <w:t xml:space="preserve">  |  솔루션본부  |  </w:t>
+      </w:r>
+      <w:r>
+        <w:rPr>
+          <w:b/>
+          <w:color w:val="E53935"/>
+          <w:sz w:val="19"/>
+        </w:rPr>
+        <w:t>개발팀장</w:t>
+      </w:r>
+    </w:p>
+    <w:p>
+      <w:pPr>
+        <w:spacing w:after="60"/>
+      </w:pPr>
+      <w:r>
+        <w:rPr>
+          <w:color w:val="909090"/>
+          <w:sz w:val="18"/>
+        </w:rPr>
+        <w:t>📅 2016.03 ~ 2019.05</w:t>
+      </w:r>
+    </w:p>
+    <w:p>
+      <w:pPr>
+        <w:spacing w:before="40" w:after="80"/>
+        <w:ind w:left="170"/>
+      </w:pPr>
+      <w:r>
+        <w:rPr>
+          <w:b/>
+          <w:color w:val="0D47A1"/>
+          <w:sz w:val="17"/>
+        </w:rPr>
+        <w:t xml:space="preserve"> JAVA </w:t>
+      </w:r>
+      <w:r>
+        <w:rPr>
+          <w:sz w:val="17"/>
+        </w:rPr>
+        <w:t xml:space="preserve">  </w:t>
+      </w:r>
+      <w:r>
+        <w:rPr>
+          <w:b/>
+          <w:color w:val="0D47A1"/>
+          <w:sz w:val="17"/>
+        </w:rPr>
+        <w:t xml:space="preserve"> Spring </w:t>
+      </w:r>
+      <w:r>
+        <w:rPr>
+          <w:sz w:val="17"/>
+        </w:rPr>
+        <w:t xml:space="preserve">  </w:t>
+      </w:r>
+      <w:r>
+        <w:rPr>
+          <w:b/>
+          <w:color w:val="0D47A1"/>
+          <w:sz w:val="17"/>
+        </w:rPr>
+        <w:t xml:space="preserve"> Nexacro </w:t>
+      </w:r>
+      <w:r>
+        <w:rPr>
+          <w:sz w:val="17"/>
+        </w:rPr>
+        <w:t xml:space="preserve">  </w:t>
+      </w:r>
+      <w:r>
+        <w:rPr>
+          <w:b/>
+          <w:color w:val="0D47A1"/>
+          <w:sz w:val="17"/>
+        </w:rPr>
+        <w:t xml:space="preserve"> Oracle </w:t>
+      </w:r>
+      <w:r>
+        <w:rPr>
+          <w:sz w:val="17"/>
+        </w:rPr>
+        <w:t xml:space="preserve">  </w:t>
+      </w:r>
+      <w:r>
+        <w:rPr>
+          <w:b/>
+          <w:color w:val="0D47A1"/>
+          <w:sz w:val="17"/>
+        </w:rPr>
+        <w:t xml:space="preserve"> MongoDB </w:t>
+      </w:r>
+      <w:r>
+        <w:rPr>
+          <w:sz w:val="17"/>
+        </w:rPr>
+        <w:t xml:space="preserve">  </w:t>
+      </w:r>
+      <w:r>
+        <w:rPr>
+          <w:b/>
+          <w:color w:val="0D47A1"/>
+          <w:sz w:val="17"/>
+        </w:rPr>
+        <w:t xml:space="preserve"> Spotfire </w:t>
+      </w:r>
+      <w:r>
+        <w:rPr>
+          <w:sz w:val="17"/>
+        </w:rPr>
+        <w:t xml:space="preserve">  </w:t>
+      </w:r>
+      <w:r>
+        <w:rPr>
+          <w:b/>
+          <w:color w:val="0D47A1"/>
+          <w:sz w:val="17"/>
+        </w:rPr>
+        <w:t xml:space="preserve"> C# </w:t>
       </w:r>
     </w:p>
     <w:p>
       <w:pPr>
         <w:spacing w:before="20" w:after="20"/>
-        <w:ind w:left="283"/>
+        <w:ind w:left="227"/>
       </w:pPr>
       <w:r>
         <w:rPr>
-          <w:sz w:val="20"/>
+          <w:color w:val="1E88E5"/>
+          <w:sz w:val="19"/>
         </w:rPr>
-        <w:t>• 자산배분 : MVO(Mean-Variance Optimization) in Python, Black-Litterman in R</w:t>
+        <w:t xml:space="preserve">▸ </w:t>
+      </w:r>
+      <w:r>
+        <w:rPr>
+          <w:sz w:val="19"/>
+        </w:rPr>
+        <w:t>AlEx OCIO 기금운용 : Nexacro, JAVA(Spring), Oracle, MongoDB, Spotfire(C#), Pro*C</w:t>
       </w:r>
     </w:p>
     <w:p>
       <w:pPr>
         <w:spacing w:before="20" w:after="20"/>
-        <w:ind w:left="283"/>
+        <w:ind w:left="227"/>
       </w:pPr>
       <w:r>
         <w:rPr>
-          <w:sz w:val="20"/>
+          <w:color w:val="1E88E5"/>
+          <w:sz w:val="19"/>
         </w:rPr>
-        <w:t>• 성과요인분해 : Brinson-Fachler in Pro*C, Bottom-Up in R, Lehmann in Pro*C, Campisi in R</w:t>
+        <w:t xml:space="preserve">▸ </w:t>
+      </w:r>
+      <w:r>
+        <w:rPr>
+          <w:sz w:val="19"/>
+        </w:rPr>
+        <w:t>블랙리터만 자산배분, 리스크배분, Brinson/리만 성과요인, CARINO smoothing</w:t>
       </w:r>
     </w:p>
     <w:p>
       <w:pPr>
         <w:spacing w:before="20" w:after="20"/>
-        <w:ind w:left="283"/>
+        <w:ind w:left="227"/>
       </w:pPr>
       <w:r>
         <w:rPr>
-          <w:sz w:val="20"/>
+          <w:color w:val="1E88E5"/>
+          <w:sz w:val="19"/>
         </w:rPr>
-        <w:t>• Spotfire BI 개발/서버관리, R-shiny 배치 모니터링, ESG 유니버스 크롤링</w:t>
+        <w:t xml:space="preserve">▸ </w:t>
+      </w:r>
+      <w:r>
+        <w:rPr>
+          <w:sz w:val="19"/>
+        </w:rPr>
+        <w:t>한국투자신탁운용 성과요인분해 : Brinson, Lehmann, 4요인분해, CARINO</w:t>
       </w:r>
     </w:p>
     <w:p>
       <w:pPr>
         <w:spacing w:before="20" w:after="20"/>
-        <w:ind w:left="283"/>
+        <w:ind w:left="227"/>
       </w:pPr>
       <w:r>
         <w:rPr>
-          <w:sz w:val="20"/>
+          <w:color w:val="1E88E5"/>
+          <w:sz w:val="19"/>
         </w:rPr>
-        <w:t>• 대체투자 분석 시스템 (fnaims.co.kr) : DB모델링 및 전체 배치 개발</w:t>
+        <w:t xml:space="preserve">▸ </w:t>
       </w:r>
+      <w:r>
+        <w:rPr>
+          <w:sz w:val="19"/>
+        </w:rPr>
+        <w:t>메타시스템 / 인사시스템 DB모델링 및 전체 개발</w:t>
+      </w:r>
+    </w:p>
+    <w:tbl>
+      <w:tblPr>
+        <w:tblW w:type="auto" w:w="0"/>
+        <w:jc w:val="left"/>
+        <w:tblLook w:firstColumn="1" w:firstRow="1" w:lastColumn="0" w:lastRow="0" w:noHBand="0" w:noVBand="1" w:val="04A0"/>
+      </w:tblPr>
+      <w:tblGrid>
+        <w:gridCol w:w="10200"/>
+      </w:tblGrid>
+      <w:tr>
+        <w:tc>
+          <w:tcPr>
+            <w:tcW w:type="dxa" w:w="10200"/>
+            <w:shd w:fill="0D47A1"/>
+          </w:tcPr>
+          <w:p>
+            <w:pPr>
+              <w:spacing w:before="0" w:after="0"/>
+            </w:pPr>
+            <w:r>
+              <w:rPr>
+                <w:b/>
+                <w:color w:val="FFFFFF"/>
+                <w:sz w:val="24"/>
+              </w:rPr>
+              <w:t xml:space="preserve">  📂  프로젝트 이력</w:t>
+            </w:r>
+          </w:p>
+        </w:tc>
+      </w:tr>
+    </w:tbl>
+    <w:p>
+      <w:pPr>
+        <w:spacing w:before="40" w:after="40"/>
+      </w:pPr>
     </w:p>
     <w:p>
       <w:pPr>
-        <w:spacing w:before="160"/>
+        <w:spacing w:before="200" w:after="60"/>
       </w:pPr>
       <w:r>
         <w:rPr>
           <w:b/>
-          <w:color w:val="1A3C6E"/>
+          <w:color w:val="0D47A1"/>
           <w:sz w:val="22"/>
         </w:rPr>
-        <w:t>FnGuide | IT전략본부 | 차장</w:t>
-      </w:r>
-    </w:p>
-    <w:p>
-      <w:r>
-        <w:rPr>
-          <w:b w:val="0"/>
-          <w:color w:val="7F8C8D"/>
-          <w:sz w:val="20"/>
-        </w:rPr>
-        <w:t>2017.12 ~ 2020.01</w:t>
+        <w:t>■ 금융권 프로젝트</w:t>
       </w:r>
     </w:p>
     <w:p>
       <w:pPr>
         <w:spacing w:before="20" w:after="20"/>
-        <w:ind w:left="283"/>
+        <w:ind w:left="227"/>
       </w:pPr>
       <w:r>
         <w:rPr>
-          <w:sz w:val="20"/>
+          <w:color w:val="1E88E5"/>
+          <w:sz w:val="19"/>
         </w:rPr>
-        <w:t>• 국민연금 정보분석 고도화 : Xplatform, Proframe(C), RD 보고서, R 기반 성과위험지표 배치</w:t>
+        <w:t xml:space="preserve">◦ </w:t>
       </w:r>
-    </w:p>
-    <w:p>
-      <w:pPr>
-        <w:spacing w:before="160"/>
-      </w:pPr>
       <w:r>
         <w:rPr>
-          <w:b/>
-          <w:color w:val="1A3C6E"/>
-          <w:sz w:val="22"/>
+          <w:sz w:val="19"/>
         </w:rPr>
-        <w:t>FnPricing | 솔루션본부 | 개발팀장</w:t>
-      </w:r>
-    </w:p>
-    <w:p>
-      <w:r>
-        <w:rPr>
-          <w:b w:val="0"/>
-          <w:color w:val="7F8C8D"/>
-          <w:sz w:val="20"/>
-        </w:rPr>
-        <w:t>2016.03 ~ 2019.05</w:t>
+        <w:t>2015.09 ~ 2016.03  신한아이타스 - 차세대 프로젝트</w:t>
       </w:r>
     </w:p>
     <w:p>
       <w:pPr>
         <w:spacing w:before="20" w:after="20"/>
-        <w:ind w:left="283"/>
+        <w:ind w:left="227"/>
       </w:pPr>
       <w:r>
         <w:rPr>
-          <w:sz w:val="20"/>
+          <w:color w:val="1E88E5"/>
+          <w:sz w:val="19"/>
         </w:rPr>
-        <w:t>• AlEx OCIO 기금운용시스템 : Nexacro, JAVA(Spring), Oracle, MongoDB, Spotfire(C#), Pro*C</w:t>
+        <w:t xml:space="preserve">◦ </w:t>
+      </w:r>
+      <w:r>
+        <w:rPr>
+          <w:sz w:val="19"/>
+        </w:rPr>
+        <w:t>2015.05 ~ 2015.07  신한아이타스 - 트레이딩 지원 시스템</w:t>
       </w:r>
     </w:p>
     <w:p>
       <w:pPr>
         <w:spacing w:before="20" w:after="20"/>
-        <w:ind w:left="283"/>
+        <w:ind w:left="227"/>
       </w:pPr>
       <w:r>
         <w:rPr>
-          <w:sz w:val="20"/>
+          <w:color w:val="1E88E5"/>
+          <w:sz w:val="19"/>
         </w:rPr>
-        <w:t>• 블랙리터만 자산배분, 리스크배분, Ex-ante/Ex-post Risk, Brinson/리만 성과요인, CARINO smoothing</w:t>
+        <w:t xml:space="preserve">◦ </w:t>
+      </w:r>
+      <w:r>
+        <w:rPr>
+          <w:sz w:val="19"/>
+        </w:rPr>
+        <w:t>2014.10 ~ 2015.02  국민건강보험공단 - 통합급여시스템</w:t>
       </w:r>
     </w:p>
     <w:p>
       <w:pPr>
         <w:spacing w:before="20" w:after="20"/>
-        <w:ind w:left="283"/>
+        <w:ind w:left="227"/>
       </w:pPr>
       <w:r>
         <w:rPr>
-          <w:sz w:val="20"/>
+          <w:color w:val="1E88E5"/>
+          <w:sz w:val="19"/>
         </w:rPr>
-        <w:t>• 한국투자신탁운용 성과요인분해 프로젝트 : Brinson, Lehmann, 4요인분해, CARINO</w:t>
+        <w:t xml:space="preserve">◦ </w:t>
+      </w:r>
+      <w:r>
+        <w:rPr>
+          <w:sz w:val="19"/>
+        </w:rPr>
+        <w:t>2013.10 ~ 2013.11  경남은행 - 차세대 프로젝트 (마케팅허브)</w:t>
       </w:r>
     </w:p>
     <w:p>
       <w:pPr>
         <w:spacing w:before="20" w:after="20"/>
-        <w:ind w:left="283"/>
+        <w:ind w:left="227"/>
       </w:pPr>
       <w:r>
         <w:rPr>
-          <w:sz w:val="20"/>
+          <w:color w:val="1E88E5"/>
+          <w:sz w:val="19"/>
         </w:rPr>
-        <w:t>• 메타시스템 / 인사시스템 개발 : DB모델링, 전체 개발</w:t>
+        <w:t xml:space="preserve">◦ </w:t>
       </w:r>
-    </w:p>
-    <w:p>
-      <w:pPr>
-        <w:spacing w:before="240" w:after="80"/>
-      </w:pPr>
       <w:r>
         <w:rPr>
-          <w:b/>
-          <w:color w:val="1A3C6E"/>
-          <w:sz w:val="26"/>
+          <w:sz w:val="19"/>
         </w:rPr>
-        <w:t>▶ 금융권 프로젝트 이력 (프리랜서)</w:t>
+        <w:t>2013.04 ~ 2013.07  미래에셋증권 - 정보계 리뉴얼(펀드 집계)</w:t>
       </w:r>
     </w:p>
     <w:p>
       <w:pPr>
         <w:spacing w:before="20" w:after="20"/>
-        <w:ind w:left="283"/>
+        <w:ind w:left="227"/>
       </w:pPr>
       <w:r>
         <w:rPr>
-          <w:sz w:val="20"/>
+          <w:color w:val="1E88E5"/>
+          <w:sz w:val="19"/>
         </w:rPr>
-        <w:t>• 2015.09 ~ 2016.03 | 신한아이타스 - 차세대 프로젝트</w:t>
+        <w:t xml:space="preserve">◦ </w:t>
+      </w:r>
+      <w:r>
+        <w:rPr>
+          <w:sz w:val="19"/>
+        </w:rPr>
+        <w:t>2013.02 ~ 2013.03  현대증권 - 해외채권매매시스템</w:t>
       </w:r>
     </w:p>
     <w:p>
       <w:pPr>
         <w:spacing w:before="20" w:after="20"/>
-        <w:ind w:left="283"/>
+        <w:ind w:left="227"/>
       </w:pPr>
       <w:r>
         <w:rPr>
-          <w:sz w:val="20"/>
+          <w:color w:val="1E88E5"/>
+          <w:sz w:val="19"/>
         </w:rPr>
-        <w:t>• 2015.05 ~ 2015.07 | 신한아이타스 - 트레이딩 지원 시스템</w:t>
+        <w:t xml:space="preserve">◦ </w:t>
+      </w:r>
+      <w:r>
+        <w:rPr>
+          <w:sz w:val="19"/>
+        </w:rPr>
+        <w:t>2012.08 ~ 2012.11  코스콤 - 영업지원/실적집계</w:t>
       </w:r>
     </w:p>
     <w:p>
       <w:pPr>
         <w:spacing w:before="20" w:after="20"/>
-        <w:ind w:left="283"/>
+        <w:ind w:left="227"/>
       </w:pPr>
       <w:r>
         <w:rPr>
-          <w:sz w:val="20"/>
+          <w:color w:val="1E88E5"/>
+          <w:sz w:val="19"/>
         </w:rPr>
-        <w:t>• 2014.10 ~ 2015.02 | 국민건강보험공단 - 통합급여시스템</w:t>
+        <w:t xml:space="preserve">◦ </w:t>
+      </w:r>
+      <w:r>
+        <w:rPr>
+          <w:sz w:val="19"/>
+        </w:rPr>
+        <w:t>2011.11 ~ 2012.04  미래에셋증권 - 자산관리/포트폴리오</w:t>
       </w:r>
     </w:p>
     <w:p>
       <w:pPr>
         <w:spacing w:before="20" w:after="20"/>
-        <w:ind w:left="283"/>
+        <w:ind w:left="227"/>
       </w:pPr>
       <w:r>
         <w:rPr>
-          <w:sz w:val="20"/>
+          <w:color w:val="1E88E5"/>
+          <w:sz w:val="19"/>
         </w:rPr>
-        <w:t>• 2013.10 ~ 2013.11 | 경남은행 - 차세대 프로젝트 (마케팅허브)</w:t>
+        <w:t xml:space="preserve">◦ </w:t>
+      </w:r>
+      <w:r>
+        <w:rPr>
+          <w:sz w:val="19"/>
+        </w:rPr>
+        <w:t>2011.04 ~ 2011.10  미래에셋증권 - 섹터집계/영업관리</w:t>
       </w:r>
     </w:p>
     <w:p>
       <w:pPr>
         <w:spacing w:before="20" w:after="20"/>
-        <w:ind w:left="283"/>
+        <w:ind w:left="227"/>
       </w:pPr>
       <w:r>
         <w:rPr>
-          <w:sz w:val="20"/>
+          <w:color w:val="1E88E5"/>
+          <w:sz w:val="19"/>
         </w:rPr>
-        <w:t>• 2013.04 ~ 2013.07 | 미래에셋증권 - 정보계 리뉴얼(펀드 집계)</w:t>
+        <w:t xml:space="preserve">◦ </w:t>
+      </w:r>
+      <w:r>
+        <w:rPr>
+          <w:sz w:val="19"/>
+        </w:rPr>
+        <w:t>2010.10 ~ 2011.03  미래에셋증권 - 컴플라이언스</w:t>
       </w:r>
     </w:p>
     <w:p>
       <w:pPr>
         <w:spacing w:before="20" w:after="20"/>
-        <w:ind w:left="283"/>
+        <w:ind w:left="227"/>
       </w:pPr>
       <w:r>
         <w:rPr>
-          <w:sz w:val="20"/>
+          <w:color w:val="1E88E5"/>
+          <w:sz w:val="19"/>
         </w:rPr>
-        <w:t>• 2013.02 ~ 2013.03 | 현대증권 - 해외채권매매시스템</w:t>
+        <w:t xml:space="preserve">◦ </w:t>
+      </w:r>
+      <w:r>
+        <w:rPr>
+          <w:sz w:val="19"/>
+        </w:rPr>
+        <w:t>2010.01 ~ 2010.09  미래에셋증권 - AML(자금세탁방지)</w:t>
       </w:r>
     </w:p>
     <w:p>
       <w:pPr>
         <w:spacing w:before="20" w:after="20"/>
-        <w:ind w:left="283"/>
+        <w:ind w:left="227"/>
       </w:pPr>
       <w:r>
         <w:rPr>
-          <w:sz w:val="20"/>
+          <w:color w:val="1E88E5"/>
+          <w:sz w:val="19"/>
         </w:rPr>
-        <w:t>• 2012.08 ~ 2012.11 | 코스콤 - 영업지원, 실적집계</w:t>
+        <w:t xml:space="preserve">◦ </w:t>
+      </w:r>
+      <w:r>
+        <w:rPr>
+          <w:sz w:val="19"/>
+        </w:rPr>
+        <w:t>2009.02 ~ 2009.12  미래에셋증권 - 고객관리/영업관리</w:t>
       </w:r>
     </w:p>
     <w:p>
       <w:pPr>
         <w:spacing w:before="20" w:after="20"/>
-        <w:ind w:left="283"/>
+        <w:ind w:left="227"/>
       </w:pPr>
       <w:r>
         <w:rPr>
-          <w:sz w:val="20"/>
+          <w:color w:val="1E88E5"/>
+          <w:sz w:val="19"/>
         </w:rPr>
-        <w:t>• 2011.11 ~ 2012.04 | 미래에셋증권 - 자산관리/포트폴리오</w:t>
+        <w:t xml:space="preserve">◦ </w:t>
+      </w:r>
+      <w:r>
+        <w:rPr>
+          <w:sz w:val="19"/>
+        </w:rPr>
+        <w:t>2008.08 ~ 2009.01  한국투자증권 - CMA 소액결제 전문조립</w:t>
+      </w:r>
+    </w:p>
+    <w:p>
+      <w:pPr>
+        <w:spacing w:before="200" w:after="60"/>
+      </w:pPr>
+      <w:r>
+        <w:rPr>
+          <w:b/>
+          <w:color w:val="616161"/>
+          <w:sz w:val="22"/>
+        </w:rPr>
+        <w:t>■ 비금융권 프로젝트</w:t>
       </w:r>
     </w:p>
     <w:p>
       <w:pPr>
         <w:spacing w:before="20" w:after="20"/>
-        <w:ind w:left="283"/>
+        <w:ind w:left="227"/>
       </w:pPr>
       <w:r>
         <w:rPr>
-          <w:sz w:val="20"/>
+          <w:color w:val="1E88E5"/>
+          <w:sz w:val="19"/>
         </w:rPr>
-        <w:t>• 2011.04 ~ 2011.10 | 미래에셋증권 - 섹터집계/영업관리</w:t>
+        <w:t xml:space="preserve">◦ </w:t>
+      </w:r>
+      <w:r>
+        <w:rPr>
+          <w:sz w:val="19"/>
+        </w:rPr>
+        <w:t>2015.07 ~ 2015.08  S oil - PRM 파트너쉽관리</w:t>
       </w:r>
     </w:p>
     <w:p>
       <w:pPr>
         <w:spacing w:before="20" w:after="20"/>
-        <w:ind w:left="283"/>
+        <w:ind w:left="227"/>
       </w:pPr>
       <w:r>
         <w:rPr>
-          <w:sz w:val="20"/>
+          <w:color w:val="1E88E5"/>
+          <w:sz w:val="19"/>
         </w:rPr>
-        <w:t>• 2010.10 ~ 2011.03 | 미래에셋증권 - 컴플라이언스 시스템</w:t>
+        <w:t xml:space="preserve">◦ </w:t>
+      </w:r>
+      <w:r>
+        <w:rPr>
+          <w:sz w:val="19"/>
+        </w:rPr>
+        <w:t>2015.02 ~ 2015.05  SK Telecom - 빌링시스템</w:t>
       </w:r>
     </w:p>
     <w:p>
       <w:pPr>
         <w:spacing w:before="20" w:after="20"/>
-        <w:ind w:left="283"/>
+        <w:ind w:left="227"/>
       </w:pPr>
       <w:r>
         <w:rPr>
-          <w:sz w:val="20"/>
+          <w:color w:val="1E88E5"/>
+          <w:sz w:val="19"/>
         </w:rPr>
-        <w:t>• 2010.01 ~ 2010.09 | 미래에셋증권 - AML(자금세탁방지)</w:t>
+        <w:t xml:space="preserve">◦ </w:t>
+      </w:r>
+      <w:r>
+        <w:rPr>
+          <w:sz w:val="19"/>
+        </w:rPr>
+        <w:t>2014.05 ~ 2014.09  한국스마트카드 - 시외버스 발권</w:t>
       </w:r>
     </w:p>
     <w:p>
       <w:pPr>
         <w:spacing w:before="20" w:after="20"/>
-        <w:ind w:left="283"/>
+        <w:ind w:left="227"/>
       </w:pPr>
       <w:r>
         <w:rPr>
-          <w:sz w:val="20"/>
+          <w:color w:val="1E88E5"/>
+          <w:sz w:val="19"/>
         </w:rPr>
-        <w:t>• 2009.02 ~ 2009.12 | 미래에셋증권 - 고객관리/영업관리</w:t>
+        <w:t xml:space="preserve">◦ </w:t>
+      </w:r>
+      <w:r>
+        <w:rPr>
+          <w:sz w:val="19"/>
+        </w:rPr>
+        <w:t>2007.08 ~ 2008.07  TCO Solution - IT자산관리 SM</w:t>
       </w:r>
     </w:p>
     <w:p>
       <w:pPr>
         <w:spacing w:before="20" w:after="20"/>
-        <w:ind w:left="283"/>
+        <w:ind w:left="227"/>
       </w:pPr>
       <w:r>
         <w:rPr>
-          <w:sz w:val="20"/>
+          <w:color w:val="1E88E5"/>
+          <w:sz w:val="19"/>
         </w:rPr>
-        <w:t>• 2008.08 ~ 2009.01 | 한국투자증권 - CMA 소액결제 전문조립</w:t>
+        <w:t xml:space="preserve">◦ </w:t>
       </w:r>
+      <w:r>
+        <w:rPr>
+          <w:sz w:val="19"/>
+        </w:rPr>
+        <w:t>2004.08 ~ 2005.07  LG Telecom - 영업관리 SM</w:t>
+      </w:r>
+    </w:p>
+    <w:tbl>
+      <w:tblPr>
+        <w:tblW w:type="auto" w:w="0"/>
+        <w:jc w:val="left"/>
+        <w:tblLook w:firstColumn="1" w:firstRow="1" w:lastColumn="0" w:lastRow="0" w:noHBand="0" w:noVBand="1" w:val="04A0"/>
+      </w:tblPr>
+      <w:tblGrid>
+        <w:gridCol w:w="10200"/>
+      </w:tblGrid>
+      <w:tr>
+        <w:tc>
+          <w:tcPr>
+            <w:tcW w:type="dxa" w:w="10200"/>
+            <w:shd w:fill="0D47A1"/>
+          </w:tcPr>
+          <w:p>
+            <w:pPr>
+              <w:spacing w:before="0" w:after="0"/>
+            </w:pPr>
+            <w:r>
+              <w:rPr>
+                <w:b/>
+                <w:color w:val="FFFFFF"/>
+                <w:sz w:val="24"/>
+              </w:rPr>
+              <w:t xml:space="preserve">  🚀  개인 프로젝트</w:t>
+            </w:r>
+          </w:p>
+        </w:tc>
+      </w:tr>
+    </w:tbl>
+    <w:p>
+      <w:pPr>
+        <w:spacing w:before="40" w:after="40"/>
+      </w:pPr>
     </w:p>
     <w:p>
       <w:pPr>
-        <w:spacing w:before="160"/>
+        <w:spacing w:before="200" w:after="60"/>
       </w:pPr>
       <w:r>
         <w:rPr>
           <w:b/>
-          <w:color w:val="7F8C8D"/>
+          <w:color w:val="1E88E5"/>
           <w:sz w:val="22"/>
         </w:rPr>
-        <w:t>비금융권 프로젝트</w:t>
+        <w:t>■ DvorakQuanti - 기금운용 풀사이클 분석</w:t>
       </w:r>
     </w:p>
     <w:p>
       <w:pPr>
         <w:spacing w:before="20" w:after="20"/>
-        <w:ind w:left="283"/>
+        <w:ind w:left="227"/>
       </w:pPr>
       <w:r>
         <w:rPr>
-          <w:sz w:val="20"/>
+          <w:color w:val="1E88E5"/>
+          <w:sz w:val="19"/>
         </w:rPr>
-        <w:t>• 2015.07 ~ 2015.08 | S oil - PRM (파트너쉽관리시스템)</w:t>
+        <w:t xml:space="preserve">▸ </w:t>
+      </w:r>
+      <w:r>
+        <w:rPr>
+          <w:sz w:val="19"/>
+        </w:rPr>
+        <w:t>자산배분(MVO, Black-Litterman, Risk Parity) → 리스크 → 성과요인분해 실시간 산출 (R-shiny)</w:t>
       </w:r>
     </w:p>
     <w:p>
       <w:pPr>
         <w:spacing w:before="20" w:after="20"/>
-        <w:ind w:left="283"/>
+        <w:ind w:left="227"/>
       </w:pPr>
       <w:r>
         <w:rPr>
-          <w:sz w:val="20"/>
+          <w:color w:val="1E88E5"/>
+          <w:sz w:val="19"/>
         </w:rPr>
-        <w:t>• 2015.02 ~ 2015.05 | SK Telecom - 빌링시스템 (부가서비스 요금청구)</w:t>
+        <w:t xml:space="preserve">▸ </w:t>
+      </w:r>
+      <w:r>
+        <w:rPr>
+          <w:sz w:val="19"/>
+        </w:rPr>
+        <w:t>Carino, Menchero, Grap, Frongello, Laker smoothing 비교 분석</w:t>
       </w:r>
     </w:p>
     <w:p>
       <w:pPr>
         <w:spacing w:before="20" w:after="20"/>
-        <w:ind w:left="283"/>
+        <w:ind w:left="227"/>
       </w:pPr>
       <w:r>
         <w:rPr>
-          <w:sz w:val="20"/>
+          <w:color w:val="1E88E5"/>
+          <w:sz w:val="19"/>
         </w:rPr>
-        <w:t>• 2014.05 ~ 2014.09 | 한국스마트카드 - 통합단말/모바일 시외버스 발권시스템</w:t>
+        <w:t xml:space="preserve">▸ </w:t>
+      </w:r>
+      <w:r>
+        <w:rPr>
+          <w:sz w:val="19"/>
+        </w:rPr>
+        <w:t>https://github.com/weonjeungchang/DvorakQuanti</w:t>
+      </w:r>
+    </w:p>
+    <w:p>
+      <w:pPr>
+        <w:spacing w:before="200" w:after="60"/>
+      </w:pPr>
+      <w:r>
+        <w:rPr>
+          <w:b/>
+          <w:color w:val="1E88E5"/>
+          <w:sz w:val="22"/>
+        </w:rPr>
+        <w:t>■ DvorakStock - 주식 투자 전략</w:t>
       </w:r>
     </w:p>
     <w:p>
       <w:pPr>
         <w:spacing w:before="20" w:after="20"/>
-        <w:ind w:left="283"/>
+        <w:ind w:left="227"/>
       </w:pPr>
       <w:r>
         <w:rPr>
-          <w:sz w:val="20"/>
+          <w:color w:val="1E88E5"/>
+          <w:sz w:val="19"/>
         </w:rPr>
-        <w:t>• 2007.08 ~ 2008.07 | TCO Solution - IT자산관리/보안시스템/헬프데스크 SM</w:t>
+        <w:t xml:space="preserve">▸ </w:t>
+      </w:r>
+      <w:r>
+        <w:rPr>
+          <w:sz w:val="19"/>
+        </w:rPr>
+        <w:t>모멘텀/골든크로스 종목 선정 → Black-Litterman 비중 시뮬레이션 (R-shiny)</w:t>
       </w:r>
     </w:p>
     <w:p>
       <w:pPr>
         <w:spacing w:before="20" w:after="20"/>
-        <w:ind w:left="283"/>
+        <w:ind w:left="227"/>
       </w:pPr>
       <w:r>
         <w:rPr>
-          <w:sz w:val="20"/>
+          <w:color w:val="1E88E5"/>
+          <w:sz w:val="19"/>
         </w:rPr>
-        <w:t>• 2004.08 ~ 2005.07 | LG Telecom - 영업관리 및 개통시스템 SM</w:t>
+        <w:t xml:space="preserve">▸ </w:t>
+      </w:r>
+      <w:r>
+        <w:rPr>
+          <w:sz w:val="19"/>
+        </w:rPr>
+        <w:t>https://github.com/weonjeungchang/DvorakStock</w:t>
       </w:r>
     </w:p>
     <w:p>
       <w:pPr>
-        <w:spacing w:before="240" w:after="80"/>
+        <w:spacing w:before="200" w:after="60"/>
       </w:pPr>
       <w:r>
         <w:rPr>
           <w:b/>
-          <w:color w:val="1A3C6E"/>
-          <w:sz w:val="26"/>
-        </w:rPr>
-        <w:t>▶ 개인 프로젝트</w:t>
-      </w:r>
-    </w:p>
-    <w:p>
-      <w:pPr>
-        <w:spacing w:before="160"/>
-      </w:pPr>
-      <w:r>
-        <w:rPr>
-          <w:b/>
-          <w:color w:val="2E74B5"/>
+          <w:color w:val="1E88E5"/>
           <w:sz w:val="22"/>
         </w:rPr>
-        <w:t>DvorakQuanti - 기금운용 분석 시스템</w:t>
+        <w:t>■ 주식추천시스템 / 퇴직연금 챗봇</w:t>
       </w:r>
     </w:p>
     <w:p>
       <w:pPr>
         <w:spacing w:before="20" w:after="20"/>
-        <w:ind w:left="283"/>
+        <w:ind w:left="227"/>
       </w:pPr>
       <w:r>
         <w:rPr>
-          <w:sz w:val="20"/>
+          <w:color w:val="1E88E5"/>
+          <w:sz w:val="19"/>
         </w:rPr>
-        <w:t>• 자산배분 → 리스크 → 성과요인분해 풀사이클 실시간 산출 시스템 (R-shiny)</w:t>
+        <w:t xml:space="preserve">▸ </w:t>
+      </w:r>
+      <w:r>
+        <w:rPr>
+          <w:sz w:val="19"/>
+        </w:rPr>
+        <w:t>C#(사이보스API) 보조지표 기반 주식추천 / RAG 기반 퇴직연금 상담 챗봇</w:t>
+      </w:r>
+    </w:p>
+    <w:tbl>
+      <w:tblPr>
+        <w:tblW w:type="auto" w:w="0"/>
+        <w:jc w:val="left"/>
+        <w:tblLook w:firstColumn="1" w:firstRow="1" w:lastColumn="0" w:lastRow="0" w:noHBand="0" w:noVBand="1" w:val="04A0"/>
+      </w:tblPr>
+      <w:tblGrid>
+        <w:gridCol w:w="10200"/>
+      </w:tblGrid>
+      <w:tr>
+        <w:tc>
+          <w:tcPr>
+            <w:tcW w:type="dxa" w:w="10200"/>
+            <w:shd w:fill="0D47A1"/>
+          </w:tcPr>
+          <w:p>
+            <w:pPr>
+              <w:spacing w:before="0" w:after="0"/>
+            </w:pPr>
+            <w:r>
+              <w:rPr>
+                <w:b/>
+                <w:color w:val="FFFFFF"/>
+                <w:sz w:val="24"/>
+              </w:rPr>
+              <w:t xml:space="preserve">  📚  교육 수료</w:t>
+            </w:r>
+          </w:p>
+        </w:tc>
+      </w:tr>
+    </w:tbl>
+    <w:p>
+      <w:pPr>
+        <w:spacing w:before="40" w:after="40"/>
+      </w:pPr>
+    </w:p>
+    <w:p>
+      <w:pPr>
+        <w:spacing w:before="20" w:after="20"/>
+        <w:ind w:left="227"/>
+      </w:pPr>
+      <w:r>
+        <w:rPr>
+          <w:color w:val="1E88E5"/>
+          <w:sz w:val="19"/>
+        </w:rPr>
+        <w:t xml:space="preserve">◦ </w:t>
+      </w:r>
+      <w:r>
+        <w:rPr>
+          <w:sz w:val="19"/>
+        </w:rPr>
+        <w:t>자바 중급/입문 (2025.01, 프로그래머스)</w:t>
       </w:r>
     </w:p>
     <w:p>
       <w:pPr>
         <w:spacing w:before="20" w:after="20"/>
-        <w:ind w:left="283"/>
+        <w:ind w:left="227"/>
       </w:pPr>
       <w:r>
         <w:rPr>
-          <w:sz w:val="20"/>
+          <w:color w:val="1E88E5"/>
+          <w:sz w:val="19"/>
         </w:rPr>
-        <w:t>• MVO, Black-Litterman, Risk Parity 자산배분 모델 구현</w:t>
+        <w:t xml:space="preserve">◦ </w:t>
+      </w:r>
+      <w:r>
+        <w:rPr>
+          <w:sz w:val="19"/>
+        </w:rPr>
+        <w:t>웹 프로그래밍 풀스택 / 인공지능을 위한 선형대수 / 모두를 위한 선형대수학 (부스트코스)</w:t>
       </w:r>
     </w:p>
     <w:p>
       <w:pPr>
         <w:spacing w:before="20" w:after="20"/>
-        <w:ind w:left="283"/>
+        <w:ind w:left="227"/>
       </w:pPr>
       <w:r>
         <w:rPr>
-          <w:sz w:val="20"/>
+          <w:color w:val="1E88E5"/>
+          <w:sz w:val="19"/>
         </w:rPr>
-        <w:t>• Ex-ante/Ex-post Risk, Risk Budgeting 구현</w:t>
+        <w:t xml:space="preserve">◦ </w:t>
+      </w:r>
+      <w:r>
+        <w:rPr>
+          <w:sz w:val="19"/>
+        </w:rPr>
+        <w:t>인공지능의 이해 (2022.06, 경북대학교 SW교육센터)</w:t>
       </w:r>
     </w:p>
     <w:p>
       <w:pPr>
         <w:spacing w:before="20" w:after="20"/>
-        <w:ind w:left="283"/>
+        <w:ind w:left="227"/>
       </w:pPr>
       <w:r>
         <w:rPr>
-          <w:sz w:val="20"/>
+          <w:color w:val="1E88E5"/>
+          <w:sz w:val="19"/>
         </w:rPr>
-        <w:t>• BF, BHB, 리만 성과요인분해 모델 + Carino/Menchero/Grap/Frongello/Laker smoothing 비교</w:t>
+        <w:t xml:space="preserve">◦ </w:t>
+      </w:r>
+      <w:r>
+        <w:rPr>
+          <w:sz w:val="19"/>
+        </w:rPr>
+        <w:t>빅데이터와 통계 (2022.06, 통계교육원)</w:t>
       </w:r>
     </w:p>
     <w:p>
       <w:pPr>
         <w:spacing w:before="20" w:after="20"/>
-        <w:ind w:left="283"/>
+        <w:ind w:left="227"/>
       </w:pPr>
       <w:r>
         <w:rPr>
-          <w:sz w:val="20"/>
+          <w:color w:val="1E88E5"/>
+          <w:sz w:val="19"/>
         </w:rPr>
-        <w:t>• GitHub: https://github.com/weonjeungchang/DvorakQuanti</w:t>
+        <w:t xml:space="preserve">◦ </w:t>
       </w:r>
-    </w:p>
-    <w:p>
-      <w:pPr>
-        <w:spacing w:before="160"/>
-      </w:pPr>
       <w:r>
         <w:rPr>
-          <w:b/>
-          <w:color w:val="2E74B5"/>
-          <w:sz w:val="22"/>
+          <w:sz w:val="19"/>
         </w:rPr>
-        <w:t>DvorakStock - 주식 투자 배분 전략</w:t>
+        <w:t>레버리지 ETP/ETF/ETN (2021.01, 금융투자교육원)</w:t>
       </w:r>
     </w:p>
     <w:p>
       <w:pPr>
         <w:spacing w:before="20" w:after="20"/>
-        <w:ind w:left="283"/>
+        <w:ind w:left="227"/>
       </w:pPr>
       <w:r>
         <w:rPr>
-          <w:sz w:val="20"/>
+          <w:color w:val="1E88E5"/>
+          <w:sz w:val="19"/>
         </w:rPr>
-        <w:t>• 모멘텀, 골든크로스 기반 종목 선정 → Black-Litterman 모델 적용 투자 비중 시뮬레이션 (R-shiny)</w:t>
+        <w:t xml:space="preserve">◦ </w:t>
+      </w:r>
+      <w:r>
+        <w:rPr>
+          <w:sz w:val="19"/>
+        </w:rPr>
+        <w:t>파생상품모의거래 (2020.08, 한국거래소)</w:t>
       </w:r>
     </w:p>
     <w:p>
       <w:pPr>
         <w:spacing w:before="20" w:after="20"/>
-        <w:ind w:left="283"/>
+        <w:ind w:left="227"/>
       </w:pPr>
       <w:r>
         <w:rPr>
-          <w:sz w:val="20"/>
+          <w:color w:val="1E88E5"/>
+          <w:sz w:val="19"/>
         </w:rPr>
-        <w:t>• KRX, NAVER금융, CompanyGuide 데이터 크롤링</w:t>
+        <w:t xml:space="preserve">◦ </w:t>
       </w:r>
+      <w:r>
+        <w:rPr>
+          <w:sz w:val="19"/>
+        </w:rPr>
+        <w:t>클라우드컴퓨팅 NoSQL 구축실무 (2017.12, 한국데이터진흥원)</w:t>
+      </w:r>
+    </w:p>
+    <w:tbl>
+      <w:tblPr>
+        <w:tblW w:type="auto" w:w="0"/>
+        <w:jc w:val="left"/>
+        <w:tblLook w:firstColumn="1" w:firstRow="1" w:lastColumn="0" w:lastRow="0" w:noHBand="0" w:noVBand="1" w:val="04A0"/>
+      </w:tblPr>
+      <w:tblGrid>
+        <w:gridCol w:w="10200"/>
+      </w:tblGrid>
+      <w:tr>
+        <w:tc>
+          <w:tcPr>
+            <w:tcW w:type="dxa" w:w="10200"/>
+            <w:shd w:fill="0D47A1"/>
+          </w:tcPr>
+          <w:p>
+            <w:pPr>
+              <w:spacing w:before="0" w:after="0"/>
+            </w:pPr>
+            <w:r>
+              <w:rPr>
+                <w:b/>
+                <w:color w:val="FFFFFF"/>
+                <w:sz w:val="24"/>
+              </w:rPr>
+              <w:t xml:space="preserve">  ⚙️  기술 스택</w:t>
+            </w:r>
+          </w:p>
+        </w:tc>
+      </w:tr>
+    </w:tbl>
+    <w:p>
+      <w:pPr>
+        <w:spacing w:before="40" w:after="40"/>
+      </w:pPr>
+    </w:p>
+    <w:tbl>
+      <w:tblPr>
+        <w:tblStyle w:val="TableGrid"/>
+        <w:tblW w:type="auto" w:w="0"/>
+        <w:jc w:val="center"/>
+        <w:tblLook w:firstColumn="1" w:firstRow="1" w:lastColumn="0" w:lastRow="0" w:noHBand="0" w:noVBand="1" w:val="04A0"/>
+      </w:tblPr>
+      <w:tblGrid>
+        <w:gridCol w:w="1984"/>
+        <w:gridCol w:w="7654"/>
+      </w:tblGrid>
+      <w:tr>
+        <w:tc>
+          <w:tcPr>
+            <w:tcW w:type="dxa" w:w="5100"/>
+            <w:shd w:fill="E3F2FD"/>
+          </w:tcPr>
+          <w:p>
+            <w:pPr>
+              <w:jc w:val="center"/>
+            </w:pPr>
+            <w:r>
+              <w:rPr>
+                <w:b/>
+                <w:color w:val="0D47A1"/>
+                <w:sz w:val="18"/>
+              </w:rPr>
+              <w:t>AI / ML</w:t>
+            </w:r>
+          </w:p>
+        </w:tc>
+        <w:tc>
+          <w:tcPr>
+            <w:tcW w:type="dxa" w:w="5100"/>
+          </w:tcPr>
+          <w:p>
+            <w:r>
+              <w:rPr>
+                <w:sz w:val="17"/>
+              </w:rPr>
+              <w:t>LangChain  ·  Chroma  ·  RAG  ·  LoRA  ·  QLoRA  ·  PEFT  ·  Deep Momentum  ·  k-means  ·  Contrastive Learning  ·  LSTM  ·  Random Forest  ·  KNN  ·  Tesseract OCR</w:t>
+            </w:r>
+          </w:p>
+        </w:tc>
+      </w:tr>
+      <w:tr>
+        <w:tc>
+          <w:tcPr>
+            <w:tcW w:type="dxa" w:w="5100"/>
+            <w:shd w:fill="E3F2FD"/>
+          </w:tcPr>
+          <w:p>
+            <w:pPr>
+              <w:jc w:val="center"/>
+            </w:pPr>
+            <w:r>
+              <w:rPr>
+                <w:b/>
+                <w:color w:val="0D47A1"/>
+                <w:sz w:val="18"/>
+              </w:rPr>
+              <w:t>LLM</w:t>
+            </w:r>
+          </w:p>
+        </w:tc>
+        <w:tc>
+          <w:tcPr>
+            <w:tcW w:type="dxa" w:w="5100"/>
+          </w:tcPr>
+          <w:p>
+            <w:r>
+              <w:rPr>
+                <w:sz w:val="17"/>
+              </w:rPr>
+              <w:t>OpenAI (GPT-o1, o3)  ·  Llama (2.0, 3.1:8B)  ·  Qwen  ·  Ollama</w:t>
+            </w:r>
+          </w:p>
+        </w:tc>
+      </w:tr>
+      <w:tr>
+        <w:tc>
+          <w:tcPr>
+            <w:tcW w:type="dxa" w:w="5100"/>
+            <w:shd w:fill="E3F2FD"/>
+          </w:tcPr>
+          <w:p>
+            <w:pPr>
+              <w:jc w:val="center"/>
+            </w:pPr>
+            <w:r>
+              <w:rPr>
+                <w:b/>
+                <w:color w:val="0D47A1"/>
+                <w:sz w:val="18"/>
+              </w:rPr>
+              <w:t>Language</w:t>
+            </w:r>
+          </w:p>
+        </w:tc>
+        <w:tc>
+          <w:tcPr>
+            <w:tcW w:type="dxa" w:w="5100"/>
+          </w:tcPr>
+          <w:p>
+            <w:r>
+              <w:rPr>
+                <w:sz w:val="17"/>
+              </w:rPr>
+              <w:t>Python  ·  R  ·  JAVA  ·  C/C++ (Pro*C)  ·  C#  ·  JavaScript  ·  SQL  ·  PL-SQL  ·  Shell</w:t>
+            </w:r>
+          </w:p>
+        </w:tc>
+      </w:tr>
+      <w:tr>
+        <w:tc>
+          <w:tcPr>
+            <w:tcW w:type="dxa" w:w="5100"/>
+            <w:shd w:fill="E3F2FD"/>
+          </w:tcPr>
+          <w:p>
+            <w:pPr>
+              <w:jc w:val="center"/>
+            </w:pPr>
+            <w:r>
+              <w:rPr>
+                <w:b/>
+                <w:color w:val="0D47A1"/>
+                <w:sz w:val="18"/>
+              </w:rPr>
+              <w:t>Framework</w:t>
+            </w:r>
+          </w:p>
+        </w:tc>
+        <w:tc>
+          <w:tcPr>
+            <w:tcW w:type="dxa" w:w="5100"/>
+          </w:tcPr>
+          <w:p>
+            <w:r>
+              <w:rPr>
+                <w:sz w:val="17"/>
+              </w:rPr>
+              <w:t>Spring  ·  Flask  ·  Streamlit  ·  R-shiny  ·  Nexacro  ·  Xplatform</w:t>
+            </w:r>
+          </w:p>
+        </w:tc>
+      </w:tr>
+      <w:tr>
+        <w:tc>
+          <w:tcPr>
+            <w:tcW w:type="dxa" w:w="5100"/>
+            <w:shd w:fill="E3F2FD"/>
+          </w:tcPr>
+          <w:p>
+            <w:pPr>
+              <w:jc w:val="center"/>
+            </w:pPr>
+            <w:r>
+              <w:rPr>
+                <w:b/>
+                <w:color w:val="0D47A1"/>
+                <w:sz w:val="18"/>
+              </w:rPr>
+              <w:t>Database</w:t>
+            </w:r>
+          </w:p>
+        </w:tc>
+        <w:tc>
+          <w:tcPr>
+            <w:tcW w:type="dxa" w:w="5100"/>
+          </w:tcPr>
+          <w:p>
+            <w:r>
+              <w:rPr>
+                <w:sz w:val="17"/>
+              </w:rPr>
+              <w:t>Oracle  ·  MongoDB  ·  Chroma (Vector DB)</w:t>
+            </w:r>
+          </w:p>
+        </w:tc>
+      </w:tr>
+      <w:tr>
+        <w:tc>
+          <w:tcPr>
+            <w:tcW w:type="dxa" w:w="5100"/>
+            <w:shd w:fill="E3F2FD"/>
+          </w:tcPr>
+          <w:p>
+            <w:pPr>
+              <w:jc w:val="center"/>
+            </w:pPr>
+            <w:r>
+              <w:rPr>
+                <w:b/>
+                <w:color w:val="0D47A1"/>
+                <w:sz w:val="18"/>
+              </w:rPr>
+              <w:t>BI / 시각화</w:t>
+            </w:r>
+          </w:p>
+        </w:tc>
+        <w:tc>
+          <w:tcPr>
+            <w:tcW w:type="dxa" w:w="5100"/>
+          </w:tcPr>
+          <w:p>
+            <w:r>
+              <w:rPr>
+                <w:sz w:val="17"/>
+              </w:rPr>
+              <w:t>Spotfire  ·  Highcharts  ·  Streamlit  ·  R-shiny</w:t>
+            </w:r>
+          </w:p>
+        </w:tc>
+      </w:tr>
+      <w:tr>
+        <w:tc>
+          <w:tcPr>
+            <w:tcW w:type="dxa" w:w="5100"/>
+            <w:shd w:fill="E3F2FD"/>
+          </w:tcPr>
+          <w:p>
+            <w:pPr>
+              <w:jc w:val="center"/>
+            </w:pPr>
+            <w:r>
+              <w:rPr>
+                <w:b/>
+                <w:color w:val="0D47A1"/>
+                <w:sz w:val="18"/>
+              </w:rPr>
+              <w:t>DevOps</w:t>
+            </w:r>
+          </w:p>
+        </w:tc>
+        <w:tc>
+          <w:tcPr>
+            <w:tcW w:type="dxa" w:w="5100"/>
+          </w:tcPr>
+          <w:p>
+            <w:r>
+              <w:rPr>
+                <w:sz w:val="17"/>
+              </w:rPr>
+              <w:t>Linux  ·  Windows Server  ·  Shell Script  ·  Batch Scheduling</w:t>
+            </w:r>
+          </w:p>
+        </w:tc>
+      </w:tr>
+      <w:tr>
+        <w:tc>
+          <w:tcPr>
+            <w:tcW w:type="dxa" w:w="5100"/>
+            <w:shd w:fill="E3F2FD"/>
+          </w:tcPr>
+          <w:p>
+            <w:pPr>
+              <w:jc w:val="center"/>
+            </w:pPr>
+            <w:r>
+              <w:rPr>
+                <w:b/>
+                <w:color w:val="0D47A1"/>
+                <w:sz w:val="18"/>
+              </w:rPr>
+              <w:t>금융공학</w:t>
+            </w:r>
+          </w:p>
+        </w:tc>
+        <w:tc>
+          <w:tcPr>
+            <w:tcW w:type="dxa" w:w="5100"/>
+          </w:tcPr>
+          <w:p>
+            <w:r>
+              <w:rPr>
+                <w:sz w:val="17"/>
+              </w:rPr>
+              <w:t>MVO  ·  Black-Litterman  ·  Brinson  ·  Lehmann  ·  Campisi  ·  CARINO  ·  Risk Parity  ·  IRR  ·  Multi-Factor</w:t>
+            </w:r>
+          </w:p>
+        </w:tc>
+      </w:tr>
+    </w:tbl>
+    <w:tbl>
+      <w:tblPr>
+        <w:tblW w:type="auto" w:w="0"/>
+        <w:jc w:val="left"/>
+        <w:tblLook w:firstColumn="1" w:firstRow="1" w:lastColumn="0" w:lastRow="0" w:noHBand="0" w:noVBand="1" w:val="04A0"/>
+      </w:tblPr>
+      <w:tblGrid>
+        <w:gridCol w:w="10200"/>
+      </w:tblGrid>
+      <w:tr>
+        <w:tc>
+          <w:tcPr>
+            <w:tcW w:type="dxa" w:w="10200"/>
+            <w:shd w:fill="0D47A1"/>
+          </w:tcPr>
+          <w:p>
+            <w:pPr>
+              <w:spacing w:before="0" w:after="0"/>
+            </w:pPr>
+            <w:r>
+              <w:rPr>
+                <w:b/>
+                <w:color w:val="FFFFFF"/>
+                <w:sz w:val="24"/>
+              </w:rPr>
+              <w:t xml:space="preserve">  ✍️  자기소개서</w:t>
+            </w:r>
+          </w:p>
+        </w:tc>
+      </w:tr>
+    </w:tbl>
+    <w:p>
+      <w:pPr>
+        <w:spacing w:before="40" w:after="40"/>
+      </w:pPr>
     </w:p>
     <w:p>
       <w:pPr>
-        <w:spacing w:before="20" w:after="20"/>
-        <w:ind w:left="283"/>
+        <w:spacing w:before="60" w:after="120" w:line="312" w:lineRule="auto"/>
       </w:pPr>
       <w:r>
         <w:rPr>
-          <w:sz w:val="20"/>
-        </w:rPr>
-        <w:t>• GitHub: https://github.com/weonjeungchang/DvorakStock</w:t>
-      </w:r>
-    </w:p>
-    <w:p>
-      <w:pPr>
-        <w:spacing w:before="160"/>
-      </w:pPr>
-      <w:r>
-        <w:rPr>
-          <w:b/>
-          <w:color w:val="2E74B5"/>
-          <w:sz w:val="22"/>
-        </w:rPr>
-        <w:t>주식추천시스템</w:t>
-      </w:r>
-    </w:p>
-    <w:p>
-      <w:pPr>
-        <w:spacing w:before="20" w:after="20"/>
-        <w:ind w:left="283"/>
-      </w:pPr>
-      <w:r>
-        <w:rPr>
-          <w:sz w:val="20"/>
-        </w:rPr>
-        <w:t>• 보조지표 기반 주식추천 시스템 (C#, 대신증권 사이보스 API)</w:t>
-      </w:r>
-    </w:p>
-    <w:p>
-      <w:pPr>
-        <w:spacing w:before="160"/>
-      </w:pPr>
-      <w:r>
-        <w:rPr>
-          <w:b/>
-          <w:color w:val="2E74B5"/>
-          <w:sz w:val="22"/>
-        </w:rPr>
-        <w:t>퇴직연금 디폴트옵션 자산배분 챗봇</w:t>
-      </w:r>
-    </w:p>
-    <w:p>
-      <w:pPr>
-        <w:spacing w:before="20" w:after="20"/>
-        <w:ind w:left="283"/>
-      </w:pPr>
-      <w:r>
-        <w:rPr>
-          <w:sz w:val="20"/>
-        </w:rPr>
-        <w:t>• RAG 기반 퇴직연금 상담 챗봇 개인 프로젝트</w:t>
-      </w:r>
-    </w:p>
-    <w:p>
-      <w:pPr>
-        <w:spacing w:before="240" w:after="80"/>
-      </w:pPr>
-      <w:r>
-        <w:rPr>
-          <w:b/>
-          <w:color w:val="1A3C6E"/>
-          <w:sz w:val="26"/>
-        </w:rPr>
-        <w:t>▶ 교육 수료 사항</w:t>
-      </w:r>
-    </w:p>
-    <w:p>
-      <w:pPr>
-        <w:spacing w:before="20" w:after="20"/>
-        <w:ind w:left="283"/>
-      </w:pPr>
-      <w:r>
-        <w:rPr>
-          <w:sz w:val="20"/>
-        </w:rPr>
-        <w:t>• 자바 중급/입문 | 2025.01 | 프로그래머스</w:t>
-      </w:r>
-    </w:p>
-    <w:p>
-      <w:pPr>
-        <w:spacing w:before="20" w:after="20"/>
-        <w:ind w:left="283"/>
-      </w:pPr>
-      <w:r>
-        <w:rPr>
-          <w:sz w:val="20"/>
-        </w:rPr>
-        <w:t>• 웹 프로그래밍(풀스택) | 부스트코스</w:t>
-      </w:r>
-    </w:p>
-    <w:p>
-      <w:pPr>
-        <w:spacing w:before="20" w:after="20"/>
-        <w:ind w:left="283"/>
-      </w:pPr>
-      <w:r>
-        <w:rPr>
-          <w:sz w:val="20"/>
-        </w:rPr>
-        <w:t>• 인공지능을 위한 선형대수 | 부스트코스</w:t>
-      </w:r>
-    </w:p>
-    <w:p>
-      <w:pPr>
-        <w:spacing w:before="20" w:after="20"/>
-        <w:ind w:left="283"/>
-      </w:pPr>
-      <w:r>
-        <w:rPr>
-          <w:sz w:val="20"/>
-        </w:rPr>
-        <w:t>• 모두를 위한 선형대수학 (칸아카데미) | 부스트코스</w:t>
-      </w:r>
-    </w:p>
-    <w:p>
-      <w:pPr>
-        <w:spacing w:before="20" w:after="20"/>
-        <w:ind w:left="283"/>
-      </w:pPr>
-      <w:r>
-        <w:rPr>
-          <w:sz w:val="20"/>
-        </w:rPr>
-        <w:t>• 인공지능의 이해 | 2022.06 | 경북대학교 소프트웨어교육센터</w:t>
-      </w:r>
-    </w:p>
-    <w:p>
-      <w:pPr>
-        <w:spacing w:before="20" w:after="20"/>
-        <w:ind w:left="283"/>
-      </w:pPr>
-      <w:r>
-        <w:rPr>
-          <w:sz w:val="20"/>
-        </w:rPr>
-        <w:t>• 빅데이터와 통계 | 2022.06 | 통계교육원</w:t>
-      </w:r>
-    </w:p>
-    <w:p>
-      <w:pPr>
-        <w:spacing w:before="20" w:after="20"/>
-        <w:ind w:left="283"/>
-      </w:pPr>
-      <w:r>
-        <w:rPr>
-          <w:sz w:val="20"/>
-        </w:rPr>
-        <w:t>• 레버리지 ETP, ETF, ETN | 2021.01 | 금융투자교육원</w:t>
-      </w:r>
-    </w:p>
-    <w:p>
-      <w:pPr>
-        <w:spacing w:before="20" w:after="20"/>
-        <w:ind w:left="283"/>
-      </w:pPr>
-      <w:r>
-        <w:rPr>
-          <w:sz w:val="20"/>
-        </w:rPr>
-        <w:t>• 파생상품모의거래 | 2020.08 | 한국거래소</w:t>
-      </w:r>
-    </w:p>
-    <w:p>
-      <w:pPr>
-        <w:spacing w:before="20" w:after="20"/>
-        <w:ind w:left="283"/>
-      </w:pPr>
-      <w:r>
-        <w:rPr>
-          <w:sz w:val="20"/>
-        </w:rPr>
-        <w:t>• 클라우드컴퓨팅기반 NoSQL 구축실무 | 2017.12 | 한국데이터진흥원</w:t>
-      </w:r>
-    </w:p>
-    <w:p>
-      <w:pPr>
-        <w:spacing w:before="240" w:after="80"/>
-      </w:pPr>
-      <w:r>
-        <w:rPr>
-          <w:b/>
-          <w:color w:val="1A3C6E"/>
-          <w:sz w:val="26"/>
-        </w:rPr>
-        <w:t>▶ 자기소개서</w:t>
-      </w:r>
-    </w:p>
-    <w:p>
-      <w:r>
-        <w:rPr>
-          <w:sz w:val="20"/>
+          <w:color w:val="212121"/>
+          <w:sz w:val="19"/>
         </w:rPr>
         <w:t>한국투자증권에서 전문조립 프로그램을 시작으로 20년 이상 금융IT 프로젝트를 수행해왔습니다. 화면 개발에서 시작하여 데이터 중심의 배치 프로그램으로 전환하였고, 금융공학(자산배분, 성과요인분해, 멀티팩터)과 인공지능(LLM, RAG, Deep Learning) 양쪽을 아우르는 희소한 경력을 쌓아왔습니다.</w:t>
       </w:r>
     </w:p>
     <w:p>
+      <w:pPr>
+        <w:spacing w:before="60" w:after="120" w:line="312" w:lineRule="auto"/>
+      </w:pPr>
       <w:r>
         <w:rPr>
-          <w:sz w:val="20"/>
+          <w:color w:val="212121"/>
+          <w:sz w:val="19"/>
         </w:rPr>
         <w:t>서강대학교 경제대학원에서 인공지능경제 석사 학위를 취득하며, 이론과 실전을 겸비한 AI 금융 전문가로 성장했습니다. 위험지표 클러스터링을 통한 자산배분, RAG 기반 챗봇, OCR 문서 자동화, Multi-LLM 전략 등 인공지능을 금융 업무에 실질적으로 적용하는 것에 강점이 있습니다.</w:t>
       </w:r>
     </w:p>
     <w:p>
+      <w:pPr>
+        <w:spacing w:before="60" w:after="120" w:line="312" w:lineRule="auto"/>
+      </w:pPr>
       <w:r>
         <w:rPr>
-          <w:sz w:val="20"/>
+          <w:color w:val="212121"/>
+          <w:sz w:val="19"/>
         </w:rPr>
         <w:t>IT인력으로서만 머무르지 않고 비즈니스 모델을 학습하고, 트렌드에 맞는 기술을 습득하며, 금융IT에 최적화된 사람으로 성장해왔고 계속 성장해 나가고 있습니다.</w:t>
       </w:r>
     </w:p>
     <w:p>
+      <w:pPr>
+        <w:spacing w:before="60" w:after="120" w:line="312" w:lineRule="auto"/>
+      </w:pPr>
       <w:r>
         <w:rPr>
-          <w:sz w:val="20"/>
+          <w:color w:val="212121"/>
+          <w:sz w:val="19"/>
         </w:rPr>
         <w:t>저를 두 단어로 표현하자면 "호기심"과 "뚜벅뚜벅"입니다.</w:t>
         <w:br/>
@@ -1715,265 +3521,9 @@
         <w:t>어려움이 있어도 포기하지 않고 차근차근 문제를 해결해 나가며, 끊임없이 새로운 것을 배우고, 더 나은 방향을 향해 한 발 한 발 나아가는 사람입니다.</w:t>
       </w:r>
     </w:p>
-    <w:p>
-      <w:pPr>
-        <w:spacing w:before="240" w:after="80"/>
-      </w:pPr>
-      <w:r>
-        <w:rPr>
-          <w:b/>
-          <w:color w:val="1A3C6E"/>
-          <w:sz w:val="26"/>
-        </w:rPr>
-        <w:t>▶ 기술 스택 종합</w:t>
-      </w:r>
-    </w:p>
-    <w:tbl>
-      <w:tblPr>
-        <w:tblStyle w:val="TableGrid"/>
-        <w:tblW w:type="auto" w:w="0"/>
-        <w:tblLook w:firstColumn="1" w:firstRow="1" w:lastColumn="0" w:lastRow="0" w:noHBand="0" w:noVBand="1" w:val="04A0"/>
-      </w:tblPr>
-      <w:tblGrid>
-        <w:gridCol w:w="4986"/>
-        <w:gridCol w:w="4986"/>
-      </w:tblGrid>
-      <w:tr>
-        <w:tc>
-          <w:tcPr>
-            <w:tcW w:type="dxa" w:w="4986"/>
-          </w:tcPr>
-          <w:p>
-            <w:r>
-              <w:rPr>
-                <w:b/>
-                <w:sz w:val="18"/>
-              </w:rPr>
-              <w:t>AI/ML</w:t>
-            </w:r>
-          </w:p>
-        </w:tc>
-        <w:tc>
-          <w:tcPr>
-            <w:tcW w:type="dxa" w:w="4986"/>
-          </w:tcPr>
-          <w:p>
-            <w:r>
-              <w:rPr>
-                <w:sz w:val="18"/>
-              </w:rPr>
-              <w:t>LangChain, Chroma, RAG, LoRA, QLoRA, PEFT, Deep Momentum, k-means, Contrastive Learning, LSTM, Random Forest, KNN, OLS, Tesseract OCR</w:t>
-            </w:r>
-          </w:p>
-        </w:tc>
-      </w:tr>
-      <w:tr>
-        <w:tc>
-          <w:tcPr>
-            <w:tcW w:type="dxa" w:w="4986"/>
-          </w:tcPr>
-          <w:p>
-            <w:r>
-              <w:rPr>
-                <w:b/>
-                <w:sz w:val="18"/>
-              </w:rPr>
-              <w:t>LLM</w:t>
-            </w:r>
-          </w:p>
-        </w:tc>
-        <w:tc>
-          <w:tcPr>
-            <w:tcW w:type="dxa" w:w="4986"/>
-          </w:tcPr>
-          <w:p>
-            <w:r>
-              <w:rPr>
-                <w:sz w:val="18"/>
-              </w:rPr>
-              <w:t>OpenAI (GPT-o1, o3), Llama (2.0, 3.1:8B), Qwen, Ollama</w:t>
-            </w:r>
-          </w:p>
-        </w:tc>
-      </w:tr>
-      <w:tr>
-        <w:tc>
-          <w:tcPr>
-            <w:tcW w:type="dxa" w:w="4986"/>
-          </w:tcPr>
-          <w:p>
-            <w:r>
-              <w:rPr>
-                <w:b/>
-                <w:sz w:val="18"/>
-              </w:rPr>
-              <w:t>Language</w:t>
-            </w:r>
-          </w:p>
-        </w:tc>
-        <w:tc>
-          <w:tcPr>
-            <w:tcW w:type="dxa" w:w="4986"/>
-          </w:tcPr>
-          <w:p>
-            <w:r>
-              <w:rPr>
-                <w:sz w:val="18"/>
-              </w:rPr>
-              <w:t>Python, R, JAVA, C/C++(Pro*C), C#, JavaScript, SQL, PL-SQL, Shell</w:t>
-            </w:r>
-          </w:p>
-        </w:tc>
-      </w:tr>
-      <w:tr>
-        <w:tc>
-          <w:tcPr>
-            <w:tcW w:type="dxa" w:w="4986"/>
-          </w:tcPr>
-          <w:p>
-            <w:r>
-              <w:rPr>
-                <w:b/>
-                <w:sz w:val="18"/>
-              </w:rPr>
-              <w:t>Framework</w:t>
-            </w:r>
-          </w:p>
-        </w:tc>
-        <w:tc>
-          <w:tcPr>
-            <w:tcW w:type="dxa" w:w="4986"/>
-          </w:tcPr>
-          <w:p>
-            <w:r>
-              <w:rPr>
-                <w:sz w:val="18"/>
-              </w:rPr>
-              <w:t>Spring, Flask, Streamlit, R-shiny, Nexacro, Xplatform</w:t>
-            </w:r>
-          </w:p>
-        </w:tc>
-      </w:tr>
-      <w:tr>
-        <w:tc>
-          <w:tcPr>
-            <w:tcW w:type="dxa" w:w="4986"/>
-          </w:tcPr>
-          <w:p>
-            <w:r>
-              <w:rPr>
-                <w:b/>
-                <w:sz w:val="18"/>
-              </w:rPr>
-              <w:t>Database</w:t>
-            </w:r>
-          </w:p>
-        </w:tc>
-        <w:tc>
-          <w:tcPr>
-            <w:tcW w:type="dxa" w:w="4986"/>
-          </w:tcPr>
-          <w:p>
-            <w:r>
-              <w:rPr>
-                <w:sz w:val="18"/>
-              </w:rPr>
-              <w:t>Oracle, MongoDB, Chroma (Vector DB)</w:t>
-            </w:r>
-          </w:p>
-        </w:tc>
-      </w:tr>
-      <w:tr>
-        <w:tc>
-          <w:tcPr>
-            <w:tcW w:type="dxa" w:w="4986"/>
-          </w:tcPr>
-          <w:p>
-            <w:r>
-              <w:rPr>
-                <w:b/>
-                <w:sz w:val="18"/>
-              </w:rPr>
-              <w:t>BI/시각화</w:t>
-            </w:r>
-          </w:p>
-        </w:tc>
-        <w:tc>
-          <w:tcPr>
-            <w:tcW w:type="dxa" w:w="4986"/>
-          </w:tcPr>
-          <w:p>
-            <w:r>
-              <w:rPr>
-                <w:sz w:val="18"/>
-              </w:rPr>
-              <w:t>Spotfire, Highcharts, Streamlit, R-shiny</w:t>
-            </w:r>
-          </w:p>
-        </w:tc>
-      </w:tr>
-      <w:tr>
-        <w:tc>
-          <w:tcPr>
-            <w:tcW w:type="dxa" w:w="4986"/>
-          </w:tcPr>
-          <w:p>
-            <w:r>
-              <w:rPr>
-                <w:b/>
-                <w:sz w:val="18"/>
-              </w:rPr>
-              <w:t>DevOps</w:t>
-            </w:r>
-          </w:p>
-        </w:tc>
-        <w:tc>
-          <w:tcPr>
-            <w:tcW w:type="dxa" w:w="4986"/>
-          </w:tcPr>
-          <w:p>
-            <w:r>
-              <w:rPr>
-                <w:sz w:val="18"/>
-              </w:rPr>
-              <w:t>Linux, Windows Server, Shell Script, Batch Scheduling</w:t>
-            </w:r>
-          </w:p>
-        </w:tc>
-      </w:tr>
-      <w:tr>
-        <w:tc>
-          <w:tcPr>
-            <w:tcW w:type="dxa" w:w="4986"/>
-          </w:tcPr>
-          <w:p>
-            <w:r>
-              <w:rPr>
-                <w:b/>
-                <w:sz w:val="18"/>
-              </w:rPr>
-              <w:t>금융공학</w:t>
-            </w:r>
-          </w:p>
-        </w:tc>
-        <w:tc>
-          <w:tcPr>
-            <w:tcW w:type="dxa" w:w="4986"/>
-          </w:tcPr>
-          <w:p>
-            <w:r>
-              <w:rPr>
-                <w:sz w:val="18"/>
-              </w:rPr>
-              <w:t>MVO, Black-Litterman, Brinson, Lehmann, Campisi, CARINO, Risk Parity, IRR, Multi-Factor</w:t>
-            </w:r>
-          </w:p>
-        </w:tc>
-      </w:tr>
-    </w:tbl>
     <w:sectPr>
       <w:pgSz w:w="12240" w:h="15840"/>
-      <w:pgMar w:top="850" w:right="1134" w:bottom="850" w:left="1134" w:header="720" w:footer="720" w:gutter="0"/>
+      <w:pgMar w:top="680" w:right="1020" w:bottom="680" w:left="1020" w:header="720" w:footer="720" w:gutter="0"/>
       <w:cols w:space="720"/>
       <w:docGrid w:linePitch="360"/>
     </w:sectPr>
@@ -2345,11 +3895,11 @@
     <w:qFormat/>
     <w:rsid w:val="00FC693F"/>
     <w:pPr>
-      <w:spacing w:after="40" w:before="40"/>
+      <w:spacing w:after="20" w:before="20" w:line="276" w:lineRule="auto"/>
     </w:pPr>
     <w:rPr>
       <w:rFonts w:ascii="맑은 고딕" w:hAnsi="맑은 고딕"/>
-      <w:sz w:val="20"/>
+      <w:sz w:val="19"/>
     </w:rPr>
   </w:style>
   <w:style w:type="paragraph" w:styleId="Header">

</xml_diff>